<commit_message>
Align competition logic/docs with official rules; add run revoke/redo, intervention auto-end, and offline resilience
- Fix stage/attempt-count and checkpoint-scoring doc drift (STATES.md, DECISIONS.md,
  DRY_RUN.md) against the official Rule 4.5/6.2/6.7/4.4(4) text; remove a dead,
  non-compliant final-placement code path
- Seed the single rules-defined penalty (5s unauthorized intervention, Rule 7.3)
  and drop invented penalty categories from the mock server
- Add admin run revoke/redo (Rule 5.5), open revoke to committee while keeping
  time correction and redo admin-only (Rules 5.5, 8.5(1))
- Auto-end a run on its third unauthorized intervention per attempt (Rule 7.3(3))
  instead of only stacking time charges
- Add frontend network retry/offline banner and backend DynamoDB retry tuning for
  intermittent competition-day connectivity
</commit_message>
<xml_diff>
--- a/ltrc_application.docx
+++ b/ltrc_application.docx
@@ -1,6 +1,6 @@
 
 <file path=word/document.xml><?xml version="1.0" encoding="utf-8"?>
-<w:document xmlns:wpc="http://schemas.microsoft.com/office/word/2010/wordprocessingCanvas" xmlns:cx="http://schemas.microsoft.com/office/drawing/2014/chartex" xmlns:cx1="http://schemas.microsoft.com/office/drawing/2015/9/8/chartex" xmlns:cx2="http://schemas.microsoft.com/office/drawing/2015/10/21/chartex" xmlns:cx3="http://schemas.microsoft.com/office/drawing/2016/5/9/chartex" xmlns:cx4="http://schemas.microsoft.com/office/drawing/2016/5/10/chartex" xmlns:cx5="http://schemas.microsoft.com/office/drawing/2016/5/11/chartex" xmlns:cx6="http://schemas.microsoft.com/office/drawing/2016/5/12/chartex" xmlns:cx7="http://schemas.microsoft.com/office/drawing/2016/5/13/chartex" xmlns:cx8="http://schemas.microsoft.com/office/drawing/2016/5/14/chartex" xmlns:mc="http://schemas.openxmlformats.org/markup-compatibility/2006" xmlns:aink="http://schemas.microsoft.com/office/drawing/2016/ink" xmlns:am3d="http://schemas.microsoft.com/office/drawing/2017/model3d" xmlns:o="urn:schemas-microsoft-com:office:office" xmlns:oel="http://schemas.microsoft.com/office/2019/extlst" xmlns:r="http://schemas.openxmlformats.org/officeDocument/2006/relationships" xmlns:m="http://schemas.openxmlformats.org/officeDocument/2006/math" xmlns:v="urn:schemas-microsoft-com:vml" xmlns:wp14="http://schemas.microsoft.com/office/word/2010/wordprocessingDrawing" xmlns:wp="http://schemas.openxmlformats.org/drawingml/2006/wordprocessingDrawing" xmlns:w10="urn:schemas-microsoft-com:office:word" xmlns:w="http://schemas.openxmlformats.org/wordprocessingml/2006/main" xmlns:w14="http://schemas.microsoft.com/office/word/2010/wordml" xmlns:w15="http://schemas.microsoft.com/office/word/2012/wordml" xmlns:w16cex="http://schemas.microsoft.com/office/word/2018/wordml/cex" xmlns:w16cid="http://schemas.microsoft.com/office/word/2016/wordml/cid" xmlns:w16="http://schemas.microsoft.com/office/word/2018/wordml" xmlns:w16du="http://schemas.microsoft.com/office/word/2023/wordml/word16du" xmlns:w16sdtdh="http://schemas.microsoft.com/office/word/2020/wordml/sdtdatahash" xmlns:w16sdtfl="http://schemas.microsoft.com/office/word/2024/wordml/sdtformatlock" xmlns:w16se="http://schemas.microsoft.com/office/word/2015/wordml/symex" xmlns:wpg="http://schemas.microsoft.com/office/word/2010/wordprocessingGroup" xmlns:wpi="http://schemas.microsoft.com/office/word/2010/wordprocessingInk" xmlns:wne="http://schemas.microsoft.com/office/word/2006/wordml" xmlns:wps="http://schemas.microsoft.com/office/word/2010/wordprocessingShape" mc:Ignorable="w14 w15 w16se w16cid w16 w16cex w16sdtdh w16sdtfl w16du wp14">
+<w:document xmlns:wpc="http://schemas.microsoft.com/office/word/2010/wordprocessingCanvas" xmlns:cx="http://schemas.microsoft.com/office/drawing/2014/chartex" xmlns:cx1="http://schemas.microsoft.com/office/drawing/2015/9/8/chartex" xmlns:cx2="http://schemas.microsoft.com/office/drawing/2015/10/21/chartex" xmlns:cx3="http://schemas.microsoft.com/office/drawing/2016/5/9/chartex" xmlns:cx4="http://schemas.microsoft.com/office/drawing/2016/5/10/chartex" xmlns:cx5="http://schemas.microsoft.com/office/drawing/2016/5/11/chartex" xmlns:cx6="http://schemas.microsoft.com/office/drawing/2016/5/12/chartex" xmlns:cx7="http://schemas.microsoft.com/office/drawing/2016/5/13/chartex" xmlns:cx8="http://schemas.microsoft.com/office/drawing/2016/5/14/chartex" xmlns:mc="http://schemas.openxmlformats.org/markup-compatibility/2006" xmlns:aink="http://schemas.microsoft.com/office/drawing/2016/ink" xmlns:am3d="http://schemas.microsoft.com/office/drawing/2017/model3d" xmlns:o="urn:schemas-microsoft-com:office:office" xmlns:oel="http://schemas.microsoft.com/office/2019/extlst" xmlns:r="http://schemas.openxmlformats.org/officeDocument/2006/relationships" xmlns:m="http://schemas.openxmlformats.org/officeDocument/2006/math" xmlns:v="urn:schemas-microsoft-com:vml" xmlns:wp14="http://schemas.microsoft.com/office/word/2010/wordprocessingDrawing" xmlns:wp="http://schemas.openxmlformats.org/drawingml/2006/wordprocessingDrawing" xmlns:w10="urn:schemas-microsoft-com:office:word" xmlns:w="http://schemas.openxmlformats.org/wordprocessingml/2006/main" xmlns:w14="http://schemas.microsoft.com/office/word/2010/wordml" xmlns:w15="http://schemas.microsoft.com/office/word/2012/wordml" xmlns:w16cei="http://schemas.microsoft.com/office/word/2026/wordml/cei" xmlns:w16cex="http://schemas.microsoft.com/office/word/2018/wordml/cex" xmlns:w16cid="http://schemas.microsoft.com/office/word/2016/wordml/cid" xmlns:w16="http://schemas.microsoft.com/office/word/2018/wordml" xmlns:w16du="http://schemas.microsoft.com/office/word/2023/wordml/word16du" xmlns:w16sdtdh="http://schemas.microsoft.com/office/word/2020/wordml/sdtdatahash" xmlns:w16sdtfl="http://schemas.microsoft.com/office/word/2024/wordml/sdtformatlock" xmlns:w16se="http://schemas.microsoft.com/office/word/2015/wordml/symex" xmlns:wpg="http://schemas.microsoft.com/office/word/2010/wordprocessingGroup" xmlns:wpi="http://schemas.microsoft.com/office/word/2010/wordprocessingInk" xmlns:wne="http://schemas.microsoft.com/office/word/2006/wordml" xmlns:wps="http://schemas.microsoft.com/office/word/2010/wordprocessingShape" mc:Ignorable="w14 w15 w16se w16cid w16 w16cex w16sdtdh w16sdtfl w16du wp14">
   <w:body>
     <w:tbl>
       <w:tblPr>
@@ -45,9 +45,9 @@
                 <w:szCs w:val="28"/>
               </w:rPr>
               <w:drawing>
-                <wp:inline distT="0" distB="0" distL="0" distR="0" wp14:anchorId="5F9934E2" wp14:editId="138EA157">
-                  <wp:extent cx="469720" cy="539538"/>
-                  <wp:effectExtent l="0" t="0" r="6985" b="0"/>
+                <wp:inline distT="0" distB="0" distL="0" distR="0" wp14:anchorId="5F9934E2" wp14:editId="481256A1">
+                  <wp:extent cx="514130" cy="590550"/>
+                  <wp:effectExtent l="0" t="0" r="635" b="0"/>
                   <wp:docPr id="631934469" name="Picture 2"/>
                   <wp:cNvGraphicFramePr>
                     <a:graphicFrameLocks xmlns:a="http://schemas.openxmlformats.org/drawingml/2006/main" noChangeAspect="1"/>
@@ -75,7 +75,7 @@
                         <pic:spPr bwMode="auto">
                           <a:xfrm>
                             <a:off x="0" y="0"/>
-                            <a:ext cx="470236" cy="540131"/>
+                            <a:ext cx="551984" cy="634030"/>
                           </a:xfrm>
                           <a:prstGeom prst="rect">
                             <a:avLst/>
@@ -107,6 +107,8 @@
               <w:jc w:val="center"/>
               <w:rPr>
                 <w:rFonts w:ascii="TH Sarabun New" w:hAnsi="TH Sarabun New" w:cs="TH Sarabun New"/>
+                <w:b/>
+                <w:bCs/>
                 <w:sz w:val="32"/>
                 <w:szCs w:val="32"/>
               </w:rPr>
@@ -128,11 +130,17 @@
               <w:jc w:val="center"/>
               <w:rPr>
                 <w:rFonts w:ascii="TH Sarabun New" w:hAnsi="TH Sarabun New" w:cs="TH Sarabun New"/>
-              </w:rPr>
-            </w:pPr>
-            <w:r>
-              <w:rPr>
-                <w:rFonts w:ascii="TH Sarabun New" w:hAnsi="TH Sarabun New" w:cs="TH Sarabun New"/>
+                <w:b/>
+                <w:bCs/>
+                <w:sz w:val="32"/>
+                <w:szCs w:val="32"/>
+              </w:rPr>
+            </w:pPr>
+            <w:r>
+              <w:rPr>
+                <w:rFonts w:ascii="TH Sarabun New" w:hAnsi="TH Sarabun New" w:cs="TH Sarabun New"/>
+                <w:b/>
+                <w:bCs/>
                 <w:sz w:val="32"/>
                 <w:szCs w:val="32"/>
                 <w:cs/>
@@ -142,27 +150,43 @@
             <w:r>
               <w:rPr>
                 <w:rFonts w:ascii="TH Sarabun New" w:hAnsi="TH Sarabun New" w:cs="TH Sarabun New"/>
-                <w:sz w:val="32"/>
-                <w:szCs w:val="32"/>
-              </w:rPr>
-              <w:t xml:space="preserve"> (SKRC):</w:t>
-            </w:r>
-            <w:r>
-              <w:rPr>
-                <w:rFonts w:ascii="TH Sarabun New" w:hAnsi="TH Sarabun New" w:cs="TH Sarabun New"/>
-                <w:sz w:val="32"/>
-                <w:szCs w:val="32"/>
-                <w:cs/>
-              </w:rPr>
-              <w:t xml:space="preserve"> ฝ่ายจัดการแข่งขันและอีเวนต์ </w:t>
-            </w:r>
-            <w:r>
-              <w:rPr>
-                <w:rFonts w:ascii="TH Sarabun New" w:hAnsi="TH Sarabun New" w:cs="TH Sarabun New"/>
-                <w:sz w:val="32"/>
-                <w:szCs w:val="32"/>
-              </w:rPr>
-              <w:t>(Competition and SKRC Event)</w:t>
+                <w:b/>
+                <w:bCs/>
+                <w:sz w:val="32"/>
+                <w:szCs w:val="32"/>
+              </w:rPr>
+              <w:t xml:space="preserve"> (SKRC)</w:t>
+            </w:r>
+            <w:r>
+              <w:rPr>
+                <w:rFonts w:ascii="TH Sarabun New" w:hAnsi="TH Sarabun New" w:cs="TH Sarabun New"/>
+                <w:b/>
+                <w:bCs/>
+                <w:sz w:val="32"/>
+                <w:szCs w:val="32"/>
+              </w:rPr>
+              <w:t xml:space="preserve">: </w:t>
+            </w:r>
+            <w:r>
+              <w:rPr>
+                <w:rFonts w:ascii="TH Sarabun New" w:hAnsi="TH Sarabun New" w:cs="TH Sarabun New"/>
+                <w:b/>
+                <w:bCs/>
+                <w:sz w:val="32"/>
+                <w:szCs w:val="32"/>
+                <w:cs/>
+              </w:rPr>
+              <w:t xml:space="preserve">เอกสารใบสมัครเข้าร่วมการแข่งขัน </w:t>
+            </w:r>
+            <w:r>
+              <w:rPr>
+                <w:rFonts w:ascii="TH Sarabun New" w:hAnsi="TH Sarabun New" w:cs="TH Sarabun New"/>
+                <w:b/>
+                <w:bCs/>
+                <w:sz w:val="32"/>
+                <w:szCs w:val="32"/>
+              </w:rPr>
+              <w:t>SKRC Line Tracing Open 2026</w:t>
             </w:r>
           </w:p>
         </w:tc>
@@ -175,35 +199,23 @@
           </w:tcPr>
           <w:p>
             <w:pPr>
-              <w:jc w:val="center"/>
-              <w:rPr>
-                <w:rFonts w:ascii="TH Sarabun New" w:hAnsi="TH Sarabun New" w:cs="TH Sarabun New"/>
-                <w:b/>
-                <w:bCs/>
-                <w:sz w:val="32"/>
-                <w:szCs w:val="32"/>
-              </w:rPr>
-            </w:pPr>
-            <w:r>
-              <w:rPr>
-                <w:rFonts w:ascii="TH Sarabun New" w:hAnsi="TH Sarabun New" w:cs="TH Sarabun New"/>
-                <w:b/>
-                <w:bCs/>
-                <w:sz w:val="32"/>
-                <w:szCs w:val="32"/>
-                <w:cs/>
-              </w:rPr>
-              <w:t xml:space="preserve">เอกสารใบสมัครเข้าร่วมการแข่งขัน </w:t>
-            </w:r>
-            <w:r>
-              <w:rPr>
-                <w:rFonts w:ascii="TH Sarabun New" w:hAnsi="TH Sarabun New" w:cs="TH Sarabun New"/>
-                <w:b/>
-                <w:bCs/>
-                <w:sz w:val="32"/>
-                <w:szCs w:val="32"/>
-              </w:rPr>
-              <w:t>SKRC Line Tracing Open 2026</w:t>
+              <w:rPr>
+                <w:rFonts w:ascii="TH Sarabun New" w:hAnsi="TH Sarabun New" w:cs="TH Sarabun New"/>
+                <w:b/>
+                <w:bCs/>
+                <w:sz w:val="32"/>
+                <w:szCs w:val="32"/>
+              </w:rPr>
+            </w:pPr>
+            <w:r>
+              <w:rPr>
+                <w:rFonts w:ascii="TH Sarabun New" w:hAnsi="TH Sarabun New" w:cs="TH Sarabun New"/>
+                <w:b/>
+                <w:bCs/>
+                <w:sz w:val="32"/>
+                <w:szCs w:val="32"/>
+              </w:rPr>
+              <w:t>(0) PDPA Consent</w:t>
             </w:r>
           </w:p>
         </w:tc>
@@ -211,6 +223,128 @@
       <w:tr>
         <w:tc>
           <w:tcPr>
+            <w:tcW w:w="5076" w:type="dxa"/>
+            <w:gridSpan w:val="2"/>
+          </w:tcPr>
+          <w:p>
+            <w:pPr>
+              <w:rPr>
+                <w:rFonts w:ascii="TH Sarabun New" w:hAnsi="TH Sarabun New" w:cs="TH Sarabun New"/>
+                <w:b/>
+                <w:bCs/>
+                <w:sz w:val="32"/>
+                <w:szCs w:val="32"/>
+              </w:rPr>
+            </w:pPr>
+            <w:r>
+              <w:rPr>
+                <w:rFonts w:ascii="TH Sarabun New" w:hAnsi="TH Sarabun New" w:cs="TH Sarabun New"/>
+                <w:sz w:val="32"/>
+                <w:szCs w:val="32"/>
+              </w:rPr>
+              <w:t>Agreement Version:</w:t>
+            </w:r>
+            <w:r>
+              <w:rPr>
+                <w:rFonts w:ascii="TH Sarabun New" w:hAnsi="TH Sarabun New" w:cs="TH Sarabun New"/>
+                <w:b/>
+                <w:bCs/>
+                <w:sz w:val="32"/>
+                <w:szCs w:val="32"/>
+              </w:rPr>
+              <w:t xml:space="preserve"> </w:t>
+            </w:r>
+            <w:r>
+              <w:rPr>
+                <w:rFonts w:ascii="TH Sarabun New" w:hAnsi="TH Sarabun New" w:cs="TH Sarabun New"/>
+                <w:sz w:val="32"/>
+                <w:szCs w:val="32"/>
+              </w:rPr>
+              <w:t>{</w:t>
+            </w:r>
+            <w:proofErr w:type="spellStart"/>
+            <w:r>
+              <w:rPr>
+                <w:rFonts w:ascii="TH Sarabun New" w:hAnsi="TH Sarabun New" w:cs="TH Sarabun New"/>
+                <w:sz w:val="32"/>
+                <w:szCs w:val="32"/>
+              </w:rPr>
+              <w:t>PDPAVersion</w:t>
+            </w:r>
+            <w:proofErr w:type="spellEnd"/>
+            <w:r>
+              <w:rPr>
+                <w:rFonts w:ascii="TH Sarabun New" w:hAnsi="TH Sarabun New" w:cs="TH Sarabun New"/>
+                <w:sz w:val="32"/>
+                <w:szCs w:val="32"/>
+              </w:rPr>
+              <w:t>}</w:t>
+            </w:r>
+          </w:p>
+        </w:tc>
+        <w:tc>
+          <w:tcPr>
+            <w:tcW w:w="5449" w:type="dxa"/>
+            <w:gridSpan w:val="5"/>
+          </w:tcPr>
+          <w:p>
+            <w:pPr>
+              <w:rPr>
+                <w:rFonts w:ascii="TH Sarabun New" w:hAnsi="TH Sarabun New" w:cs="TH Sarabun New"/>
+                <w:sz w:val="32"/>
+                <w:szCs w:val="32"/>
+              </w:rPr>
+            </w:pPr>
+            <w:r>
+              <w:rPr>
+                <w:rFonts w:ascii="TH Sarabun New" w:hAnsi="TH Sarabun New" w:cs="TH Sarabun New"/>
+                <w:sz w:val="32"/>
+                <w:szCs w:val="32"/>
+              </w:rPr>
+              <w:t>Agreement Effective:</w:t>
+            </w:r>
+            <w:r>
+              <w:rPr>
+                <w:rFonts w:ascii="TH Sarabun New" w:hAnsi="TH Sarabun New" w:cs="TH Sarabun New"/>
+                <w:b/>
+                <w:bCs/>
+                <w:sz w:val="32"/>
+                <w:szCs w:val="32"/>
+              </w:rPr>
+              <w:t xml:space="preserve"> </w:t>
+            </w:r>
+            <w:r>
+              <w:rPr>
+                <w:rFonts w:ascii="TH Sarabun New" w:hAnsi="TH Sarabun New" w:cs="TH Sarabun New"/>
+                <w:sz w:val="32"/>
+                <w:szCs w:val="32"/>
+              </w:rPr>
+              <w:t>{</w:t>
+            </w:r>
+            <w:proofErr w:type="spellStart"/>
+            <w:r>
+              <w:rPr>
+                <w:rFonts w:ascii="TH Sarabun New" w:hAnsi="TH Sarabun New" w:cs="TH Sarabun New"/>
+                <w:sz w:val="32"/>
+                <w:szCs w:val="32"/>
+              </w:rPr>
+              <w:t>PDPAEffective</w:t>
+            </w:r>
+            <w:proofErr w:type="spellEnd"/>
+            <w:r>
+              <w:rPr>
+                <w:rFonts w:ascii="TH Sarabun New" w:hAnsi="TH Sarabun New" w:cs="TH Sarabun New"/>
+                <w:sz w:val="32"/>
+                <w:szCs w:val="32"/>
+              </w:rPr>
+              <w:t>}</w:t>
+            </w:r>
+          </w:p>
+        </w:tc>
+      </w:tr>
+      <w:tr>
+        <w:tc>
+          <w:tcPr>
             <w:tcW w:w="10525" w:type="dxa"/>
             <w:gridSpan w:val="7"/>
           </w:tcPr>
@@ -231,8 +365,9 @@
                 <w:bCs/>
                 <w:sz w:val="32"/>
                 <w:szCs w:val="32"/>
-              </w:rPr>
-              <w:t>(0) PDPA Consent</w:t>
+                <w:cs/>
+              </w:rPr>
+              <w:t>การรับทราบและให้ความยินยอม</w:t>
             </w:r>
           </w:p>
         </w:tc>
@@ -240,6 +375,106 @@
       <w:tr>
         <w:tc>
           <w:tcPr>
+            <w:tcW w:w="8066" w:type="dxa"/>
+            <w:gridSpan w:val="5"/>
+          </w:tcPr>
+          <w:p>
+            <w:pPr>
+              <w:jc w:val="thaiDistribute"/>
+              <w:rPr>
+                <w:rFonts w:ascii="TH Sarabun New" w:hAnsi="TH Sarabun New" w:cs="TH Sarabun New"/>
+                <w:sz w:val="32"/>
+                <w:szCs w:val="32"/>
+              </w:rPr>
+            </w:pPr>
+            <w:r>
+              <w:rPr>
+                <w:rFonts w:ascii="TH Sarabun New" w:hAnsi="TH Sarabun New" w:cs="TH Sarabun New"/>
+                <w:sz w:val="32"/>
+                <w:szCs w:val="32"/>
+                <w:cs/>
+              </w:rPr>
+              <w:t>ข้าพเจ้าได้อ่าน เข้าใจ และยินยอมโดยชัดแจ้งต่อการเก็บ ใช้ เปิดเผย เก็บรักษา และลบข้อมูลตามที่ระบุไว้ข้างต้น</w:t>
+            </w:r>
+          </w:p>
+        </w:tc>
+        <w:tc>
+          <w:tcPr>
+            <w:tcW w:w="2459" w:type="dxa"/>
+            <w:gridSpan w:val="2"/>
+          </w:tcPr>
+          <w:p>
+            <w:pPr>
+              <w:rPr>
+                <w:rFonts w:ascii="TH Sarabun New" w:hAnsi="TH Sarabun New" w:cs="TH Sarabun New"/>
+                <w:sz w:val="32"/>
+                <w:szCs w:val="32"/>
+              </w:rPr>
+            </w:pPr>
+            <w:r>
+              <w:rPr>
+                <w:rFonts w:ascii="TH Sarabun New" w:hAnsi="TH Sarabun New" w:cs="TH Sarabun New"/>
+                <w:sz w:val="32"/>
+                <w:szCs w:val="32"/>
+              </w:rPr>
+              <w:t>{PDPA01Consent}</w:t>
+            </w:r>
+          </w:p>
+        </w:tc>
+      </w:tr>
+      <w:tr>
+        <w:tc>
+          <w:tcPr>
+            <w:tcW w:w="10525" w:type="dxa"/>
+            <w:gridSpan w:val="7"/>
+          </w:tcPr>
+          <w:p>
+            <w:pPr>
+              <w:rPr>
+                <w:rFonts w:ascii="TH Sarabun New" w:hAnsi="TH Sarabun New" w:cs="TH Sarabun New"/>
+                <w:b/>
+                <w:bCs/>
+                <w:sz w:val="32"/>
+                <w:szCs w:val="32"/>
+              </w:rPr>
+            </w:pPr>
+            <w:r>
+              <w:rPr>
+                <w:rFonts w:ascii="TH Sarabun New" w:hAnsi="TH Sarabun New" w:cs="TH Sarabun New"/>
+                <w:b/>
+                <w:bCs/>
+                <w:sz w:val="32"/>
+                <w:szCs w:val="32"/>
+              </w:rPr>
+              <w:t xml:space="preserve">(1) </w:t>
+            </w:r>
+            <w:r>
+              <w:rPr>
+                <w:rFonts w:ascii="TH Sarabun New" w:hAnsi="TH Sarabun New" w:cs="TH Sarabun New" w:hint="cs"/>
+                <w:b/>
+                <w:bCs/>
+                <w:sz w:val="32"/>
+                <w:szCs w:val="32"/>
+                <w:cs/>
+              </w:rPr>
+              <w:t>ข้อมูลทั่วไปของใบสมัคร</w:t>
+            </w:r>
+            <w:r>
+              <w:rPr>
+                <w:rFonts w:ascii="TH Sarabun New" w:hAnsi="TH Sarabun New" w:cs="TH Sarabun New"/>
+                <w:b/>
+                <w:bCs/>
+                <w:sz w:val="32"/>
+                <w:szCs w:val="32"/>
+              </w:rPr>
+              <w:t xml:space="preserve"> </w:t>
+            </w:r>
+          </w:p>
+        </w:tc>
+      </w:tr>
+      <w:tr>
+        <w:tc>
+          <w:tcPr>
             <w:tcW w:w="5076" w:type="dxa"/>
             <w:gridSpan w:val="2"/>
           </w:tcPr>
@@ -247,37 +482,375 @@
             <w:pPr>
               <w:rPr>
                 <w:rFonts w:ascii="TH Sarabun New" w:hAnsi="TH Sarabun New" w:cs="TH Sarabun New"/>
-                <w:b/>
-                <w:bCs/>
-                <w:sz w:val="32"/>
-                <w:szCs w:val="32"/>
-              </w:rPr>
-            </w:pPr>
-            <w:r>
-              <w:rPr>
-                <w:rFonts w:ascii="TH Sarabun New" w:hAnsi="TH Sarabun New" w:cs="TH Sarabun New"/>
-                <w:sz w:val="32"/>
-                <w:szCs w:val="32"/>
-              </w:rPr>
-              <w:t>Agreement Version:</w:t>
-            </w:r>
-            <w:r>
-              <w:rPr>
-                <w:rFonts w:ascii="TH Sarabun New" w:hAnsi="TH Sarabun New" w:cs="TH Sarabun New"/>
-                <w:b/>
-                <w:bCs/>
-                <w:sz w:val="32"/>
-                <w:szCs w:val="32"/>
-              </w:rPr>
-              <w:t xml:space="preserve"> </w:t>
-            </w:r>
-            <w:r>
-              <w:rPr>
-                <w:rFonts w:ascii="TH Sarabun New" w:hAnsi="TH Sarabun New" w:cs="TH Sarabun New"/>
-                <w:sz w:val="32"/>
-                <w:szCs w:val="32"/>
-              </w:rPr>
-              <w:t>{PDPAVersion}</w:t>
+                <w:sz w:val="32"/>
+                <w:szCs w:val="32"/>
+              </w:rPr>
+            </w:pPr>
+            <w:r>
+              <w:rPr>
+                <w:rFonts w:ascii="TH Sarabun New" w:hAnsi="TH Sarabun New" w:cs="TH Sarabun New" w:hint="cs"/>
+                <w:sz w:val="32"/>
+                <w:szCs w:val="32"/>
+                <w:cs/>
+              </w:rPr>
+              <w:t>เลขที่ใบสมัคร</w:t>
+            </w:r>
+            <w:r>
+              <w:rPr>
+                <w:rFonts w:ascii="TH Sarabun New" w:hAnsi="TH Sarabun New" w:cs="TH Sarabun New"/>
+                <w:sz w:val="32"/>
+                <w:szCs w:val="32"/>
+              </w:rPr>
+              <w:t>: {</w:t>
+            </w:r>
+            <w:proofErr w:type="spellStart"/>
+            <w:r>
+              <w:rPr>
+                <w:rFonts w:ascii="TH Sarabun New" w:hAnsi="TH Sarabun New" w:cs="TH Sarabun New"/>
+                <w:sz w:val="32"/>
+                <w:szCs w:val="32"/>
+              </w:rPr>
+              <w:t>CompetitorID</w:t>
+            </w:r>
+            <w:proofErr w:type="spellEnd"/>
+            <w:r>
+              <w:rPr>
+                <w:rFonts w:ascii="TH Sarabun New" w:hAnsi="TH Sarabun New" w:cs="TH Sarabun New"/>
+                <w:sz w:val="32"/>
+                <w:szCs w:val="32"/>
+              </w:rPr>
+              <w:t>}</w:t>
+            </w:r>
+          </w:p>
+        </w:tc>
+        <w:tc>
+          <w:tcPr>
+            <w:tcW w:w="2702" w:type="dxa"/>
+            <w:gridSpan w:val="2"/>
+          </w:tcPr>
+          <w:p>
+            <w:pPr>
+              <w:rPr>
+                <w:rFonts w:ascii="TH Sarabun New" w:hAnsi="TH Sarabun New" w:cs="TH Sarabun New"/>
+                <w:sz w:val="32"/>
+                <w:szCs w:val="32"/>
+                <w:cs/>
+              </w:rPr>
+            </w:pPr>
+            <w:r>
+              <w:rPr>
+                <w:rFonts w:ascii="TH Sarabun New" w:hAnsi="TH Sarabun New" w:cs="TH Sarabun New" w:hint="cs"/>
+                <w:sz w:val="32"/>
+                <w:szCs w:val="32"/>
+                <w:cs/>
+              </w:rPr>
+              <w:t>วันที่สมัคร</w:t>
+            </w:r>
+            <w:r>
+              <w:rPr>
+                <w:rFonts w:ascii="TH Sarabun New" w:hAnsi="TH Sarabun New" w:cs="TH Sarabun New"/>
+                <w:sz w:val="32"/>
+                <w:szCs w:val="32"/>
+              </w:rPr>
+              <w:t>: {</w:t>
+            </w:r>
+            <w:proofErr w:type="spellStart"/>
+            <w:r>
+              <w:rPr>
+                <w:rFonts w:ascii="TH Sarabun New" w:hAnsi="TH Sarabun New" w:cs="TH Sarabun New"/>
+                <w:sz w:val="32"/>
+                <w:szCs w:val="32"/>
+              </w:rPr>
+              <w:t>AppliedDate</w:t>
+            </w:r>
+            <w:proofErr w:type="spellEnd"/>
+            <w:r>
+              <w:rPr>
+                <w:rFonts w:ascii="TH Sarabun New" w:hAnsi="TH Sarabun New" w:cs="TH Sarabun New"/>
+                <w:sz w:val="32"/>
+                <w:szCs w:val="32"/>
+              </w:rPr>
+              <w:t>}</w:t>
+            </w:r>
+          </w:p>
+        </w:tc>
+        <w:tc>
+          <w:tcPr>
+            <w:tcW w:w="2747" w:type="dxa"/>
+            <w:gridSpan w:val="3"/>
+          </w:tcPr>
+          <w:p>
+            <w:pPr>
+              <w:rPr>
+                <w:rFonts w:ascii="TH Sarabun New" w:hAnsi="TH Sarabun New" w:cs="TH Sarabun New"/>
+                <w:sz w:val="32"/>
+                <w:szCs w:val="32"/>
+              </w:rPr>
+            </w:pPr>
+            <w:r>
+              <w:rPr>
+                <w:rFonts w:ascii="TH Sarabun New" w:hAnsi="TH Sarabun New" w:cs="TH Sarabun New" w:hint="cs"/>
+                <w:sz w:val="32"/>
+                <w:szCs w:val="32"/>
+                <w:cs/>
+              </w:rPr>
+              <w:t>วันที่อนุมัติ</w:t>
+            </w:r>
+            <w:r>
+              <w:rPr>
+                <w:rFonts w:ascii="TH Sarabun New" w:hAnsi="TH Sarabun New" w:cs="TH Sarabun New"/>
+                <w:sz w:val="32"/>
+                <w:szCs w:val="32"/>
+              </w:rPr>
+              <w:t>: {</w:t>
+            </w:r>
+            <w:proofErr w:type="spellStart"/>
+            <w:r>
+              <w:rPr>
+                <w:rFonts w:ascii="TH Sarabun New" w:hAnsi="TH Sarabun New" w:cs="TH Sarabun New"/>
+                <w:sz w:val="32"/>
+                <w:szCs w:val="32"/>
+              </w:rPr>
+              <w:t>ApproveDate</w:t>
+            </w:r>
+            <w:proofErr w:type="spellEnd"/>
+            <w:r>
+              <w:rPr>
+                <w:rFonts w:ascii="TH Sarabun New" w:hAnsi="TH Sarabun New" w:cs="TH Sarabun New"/>
+                <w:sz w:val="32"/>
+                <w:szCs w:val="32"/>
+              </w:rPr>
+              <w:t>}</w:t>
+            </w:r>
+          </w:p>
+        </w:tc>
+      </w:tr>
+      <w:tr>
+        <w:tc>
+          <w:tcPr>
+            <w:tcW w:w="10525" w:type="dxa"/>
+            <w:gridSpan w:val="7"/>
+          </w:tcPr>
+          <w:p>
+            <w:pPr>
+              <w:rPr>
+                <w:rFonts w:ascii="TH Sarabun New" w:hAnsi="TH Sarabun New" w:cs="TH Sarabun New"/>
+                <w:sz w:val="32"/>
+                <w:szCs w:val="32"/>
+              </w:rPr>
+            </w:pPr>
+            <w:r>
+              <w:rPr>
+                <w:rFonts w:ascii="TH Sarabun New" w:hAnsi="TH Sarabun New" w:cs="TH Sarabun New" w:hint="cs"/>
+                <w:sz w:val="32"/>
+                <w:szCs w:val="32"/>
+                <w:cs/>
+              </w:rPr>
+              <w:t>ชื่อทีม</w:t>
+            </w:r>
+            <w:r>
+              <w:rPr>
+                <w:rFonts w:ascii="TH Sarabun New" w:hAnsi="TH Sarabun New" w:cs="TH Sarabun New"/>
+                <w:sz w:val="32"/>
+                <w:szCs w:val="32"/>
+              </w:rPr>
+              <w:t>: {</w:t>
+            </w:r>
+            <w:proofErr w:type="spellStart"/>
+            <w:r>
+              <w:rPr>
+                <w:rFonts w:ascii="TH Sarabun New" w:hAnsi="TH Sarabun New" w:cs="TH Sarabun New"/>
+                <w:sz w:val="32"/>
+                <w:szCs w:val="32"/>
+              </w:rPr>
+              <w:t>TeamName</w:t>
+            </w:r>
+            <w:proofErr w:type="spellEnd"/>
+            <w:r>
+              <w:rPr>
+                <w:rFonts w:ascii="TH Sarabun New" w:hAnsi="TH Sarabun New" w:cs="TH Sarabun New"/>
+                <w:sz w:val="32"/>
+                <w:szCs w:val="32"/>
+              </w:rPr>
+              <w:t>}</w:t>
+            </w:r>
+          </w:p>
+        </w:tc>
+      </w:tr>
+      <w:tr>
+        <w:tc>
+          <w:tcPr>
+            <w:tcW w:w="10525" w:type="dxa"/>
+            <w:gridSpan w:val="7"/>
+          </w:tcPr>
+          <w:p>
+            <w:pPr>
+              <w:rPr>
+                <w:rFonts w:ascii="TH Sarabun New" w:hAnsi="TH Sarabun New" w:cs="TH Sarabun New"/>
+                <w:sz w:val="32"/>
+                <w:szCs w:val="32"/>
+                <w:cs/>
+              </w:rPr>
+            </w:pPr>
+            <w:r>
+              <w:rPr>
+                <w:rFonts w:ascii="TH Sarabun New" w:hAnsi="TH Sarabun New" w:cs="TH Sarabun New" w:hint="cs"/>
+                <w:sz w:val="32"/>
+                <w:szCs w:val="32"/>
+                <w:cs/>
+              </w:rPr>
+              <w:t>อีเมลติดต่อของกลุ่ม</w:t>
+            </w:r>
+            <w:r>
+              <w:rPr>
+                <w:rFonts w:ascii="TH Sarabun New" w:hAnsi="TH Sarabun New" w:cs="TH Sarabun New"/>
+                <w:sz w:val="32"/>
+                <w:szCs w:val="32"/>
+              </w:rPr>
+              <w:t>: {</w:t>
+            </w:r>
+            <w:proofErr w:type="spellStart"/>
+            <w:r>
+              <w:rPr>
+                <w:rFonts w:ascii="TH Sarabun New" w:hAnsi="TH Sarabun New" w:cs="TH Sarabun New"/>
+                <w:sz w:val="32"/>
+                <w:szCs w:val="32"/>
+              </w:rPr>
+              <w:t>CompetitorEmail</w:t>
+            </w:r>
+            <w:proofErr w:type="spellEnd"/>
+            <w:r>
+              <w:rPr>
+                <w:rFonts w:ascii="TH Sarabun New" w:hAnsi="TH Sarabun New" w:cs="TH Sarabun New"/>
+                <w:sz w:val="32"/>
+                <w:szCs w:val="32"/>
+              </w:rPr>
+              <w:t>}</w:t>
+            </w:r>
+          </w:p>
+        </w:tc>
+      </w:tr>
+      <w:tr>
+        <w:tc>
+          <w:tcPr>
+            <w:tcW w:w="10525" w:type="dxa"/>
+            <w:gridSpan w:val="7"/>
+          </w:tcPr>
+          <w:p>
+            <w:pPr>
+              <w:rPr>
+                <w:rFonts w:ascii="TH Sarabun New" w:hAnsi="TH Sarabun New" w:cs="TH Sarabun New"/>
+                <w:sz w:val="32"/>
+                <w:szCs w:val="32"/>
+              </w:rPr>
+            </w:pPr>
+            <w:r>
+              <w:rPr>
+                <w:rFonts w:ascii="TH Sarabun New" w:hAnsi="TH Sarabun New" w:cs="TH Sarabun New" w:hint="cs"/>
+                <w:sz w:val="32"/>
+                <w:szCs w:val="32"/>
+                <w:cs/>
+              </w:rPr>
+              <w:t>สถานศึกษาหลัก</w:t>
+            </w:r>
+            <w:r>
+              <w:rPr>
+                <w:rFonts w:ascii="TH Sarabun New" w:hAnsi="TH Sarabun New" w:cs="TH Sarabun New"/>
+                <w:sz w:val="32"/>
+                <w:szCs w:val="32"/>
+              </w:rPr>
+              <w:t>: {School}</w:t>
+            </w:r>
+          </w:p>
+        </w:tc>
+      </w:tr>
+      <w:tr>
+        <w:tc>
+          <w:tcPr>
+            <w:tcW w:w="10525" w:type="dxa"/>
+            <w:gridSpan w:val="7"/>
+          </w:tcPr>
+          <w:p>
+            <w:pPr>
+              <w:rPr>
+                <w:rFonts w:ascii="TH Sarabun New" w:hAnsi="TH Sarabun New" w:cs="TH Sarabun New"/>
+                <w:sz w:val="32"/>
+                <w:szCs w:val="32"/>
+              </w:rPr>
+            </w:pPr>
+            <w:r>
+              <w:rPr>
+                <w:rFonts w:ascii="TH Sarabun New" w:hAnsi="TH Sarabun New" w:cs="TH Sarabun New" w:hint="cs"/>
+                <w:sz w:val="32"/>
+                <w:szCs w:val="32"/>
+                <w:cs/>
+              </w:rPr>
+              <w:t>เกียรติบัตร</w:t>
+            </w:r>
+            <w:r>
+              <w:rPr>
+                <w:rFonts w:ascii="TH Sarabun New" w:hAnsi="TH Sarabun New" w:cs="TH Sarabun New"/>
+                <w:sz w:val="32"/>
+                <w:szCs w:val="32"/>
+              </w:rPr>
+              <w:t>: {</w:t>
+            </w:r>
+            <w:proofErr w:type="spellStart"/>
+            <w:r>
+              <w:rPr>
+                <w:rFonts w:ascii="TH Sarabun New" w:hAnsi="TH Sarabun New" w:cs="TH Sarabun New"/>
+                <w:sz w:val="32"/>
+                <w:szCs w:val="32"/>
+              </w:rPr>
+              <w:t>CertificateLang</w:t>
+            </w:r>
+            <w:proofErr w:type="spellEnd"/>
+            <w:r>
+              <w:rPr>
+                <w:rFonts w:ascii="TH Sarabun New" w:hAnsi="TH Sarabun New" w:cs="TH Sarabun New"/>
+                <w:sz w:val="32"/>
+                <w:szCs w:val="32"/>
+              </w:rPr>
+              <w:t>}</w:t>
+            </w:r>
+          </w:p>
+        </w:tc>
+      </w:tr>
+      <w:tr>
+        <w:tc>
+          <w:tcPr>
+            <w:tcW w:w="5076" w:type="dxa"/>
+            <w:gridSpan w:val="2"/>
+          </w:tcPr>
+          <w:p>
+            <w:pPr>
+              <w:rPr>
+                <w:rFonts w:ascii="TH Sarabun New" w:hAnsi="TH Sarabun New" w:cs="TH Sarabun New"/>
+                <w:sz w:val="32"/>
+                <w:szCs w:val="32"/>
+                <w:cs/>
+              </w:rPr>
+            </w:pPr>
+            <w:r>
+              <w:rPr>
+                <w:rFonts w:ascii="TH Sarabun New" w:hAnsi="TH Sarabun New" w:cs="TH Sarabun New"/>
+                <w:b/>
+                <w:bCs/>
+                <w:sz w:val="32"/>
+                <w:szCs w:val="32"/>
+              </w:rPr>
+              <w:t xml:space="preserve">(2) </w:t>
+            </w:r>
+            <w:r>
+              <w:rPr>
+                <w:rFonts w:ascii="TH Sarabun New" w:hAnsi="TH Sarabun New" w:cs="TH Sarabun New" w:hint="cs"/>
+                <w:b/>
+                <w:bCs/>
+                <w:sz w:val="32"/>
+                <w:szCs w:val="32"/>
+                <w:cs/>
+              </w:rPr>
+              <w:t>ข้อมูลอาจารย์ที่ปรึกษา</w:t>
             </w:r>
           </w:p>
         </w:tc>
@@ -292,33 +865,55 @@
                 <w:rFonts w:ascii="TH Sarabun New" w:hAnsi="TH Sarabun New" w:cs="TH Sarabun New"/>
                 <w:sz w:val="32"/>
                 <w:szCs w:val="32"/>
-              </w:rPr>
-            </w:pPr>
-            <w:r>
-              <w:rPr>
-                <w:rFonts w:ascii="TH Sarabun New" w:hAnsi="TH Sarabun New" w:cs="TH Sarabun New"/>
-                <w:sz w:val="32"/>
-                <w:szCs w:val="32"/>
-              </w:rPr>
-              <w:t>Agreement Effective:</w:t>
-            </w:r>
-            <w:r>
-              <w:rPr>
-                <w:rFonts w:ascii="TH Sarabun New" w:hAnsi="TH Sarabun New" w:cs="TH Sarabun New"/>
-                <w:b/>
-                <w:bCs/>
-                <w:sz w:val="32"/>
-                <w:szCs w:val="32"/>
-              </w:rPr>
-              <w:t xml:space="preserve"> </w:t>
-            </w:r>
-            <w:r>
-              <w:rPr>
-                <w:rFonts w:ascii="TH Sarabun New" w:hAnsi="TH Sarabun New" w:cs="TH Sarabun New"/>
-                <w:sz w:val="32"/>
-                <w:szCs w:val="32"/>
-              </w:rPr>
-              <w:t>{PDPAEffective}</w:t>
+                <w:cs/>
+              </w:rPr>
+            </w:pPr>
+            <w:r>
+              <w:rPr>
+                <w:rFonts w:ascii="TH Sarabun New" w:hAnsi="TH Sarabun New" w:cs="TH Sarabun New" w:hint="cs"/>
+                <w:b/>
+                <w:bCs/>
+                <w:color w:val="EE0000"/>
+                <w:sz w:val="32"/>
+                <w:szCs w:val="32"/>
+                <w:cs/>
+              </w:rPr>
+              <w:t>ข้อมูลการแพ้อาหาร</w:t>
+            </w:r>
+            <w:r>
+              <w:rPr>
+                <w:rFonts w:ascii="TH Sarabun New" w:hAnsi="TH Sarabun New" w:cs="TH Sarabun New"/>
+                <w:b/>
+                <w:bCs/>
+                <w:color w:val="EE0000"/>
+                <w:sz w:val="32"/>
+                <w:szCs w:val="32"/>
+              </w:rPr>
+              <w:t>: {</w:t>
+            </w:r>
+            <w:proofErr w:type="spellStart"/>
+            <w:r>
+              <w:rPr>
+                <w:rFonts w:ascii="TH Sarabun New" w:hAnsi="TH Sarabun New" w:cs="TH Sarabun New"/>
+                <w:b/>
+                <w:bCs/>
+                <w:color w:val="EE0000"/>
+                <w:sz w:val="32"/>
+                <w:szCs w:val="32"/>
+              </w:rPr>
+              <w:t>AdvisorAllergy</w:t>
+            </w:r>
+            <w:proofErr w:type="spellEnd"/>
+            <w:r>
+              <w:rPr>
+                <w:rFonts w:ascii="TH Sarabun New" w:hAnsi="TH Sarabun New" w:cs="TH Sarabun New"/>
+                <w:b/>
+                <w:bCs/>
+                <w:color w:val="EE0000"/>
+                <w:sz w:val="32"/>
+                <w:szCs w:val="32"/>
+              </w:rPr>
+              <w:t>}</w:t>
             </w:r>
           </w:p>
         </w:tc>
@@ -326,29 +921,93 @@
       <w:tr>
         <w:tc>
           <w:tcPr>
-            <w:tcW w:w="10525" w:type="dxa"/>
-            <w:gridSpan w:val="7"/>
-          </w:tcPr>
-          <w:p>
-            <w:pPr>
-              <w:rPr>
-                <w:rFonts w:ascii="TH Sarabun New" w:hAnsi="TH Sarabun New" w:cs="TH Sarabun New"/>
-                <w:b/>
-                <w:bCs/>
-                <w:sz w:val="32"/>
-                <w:szCs w:val="32"/>
-              </w:rPr>
-            </w:pPr>
-            <w:r>
-              <w:rPr>
-                <w:rFonts w:ascii="TH Sarabun New" w:hAnsi="TH Sarabun New" w:cs="TH Sarabun New"/>
-                <w:b/>
-                <w:bCs/>
-                <w:sz w:val="32"/>
-                <w:szCs w:val="32"/>
-                <w:cs/>
-              </w:rPr>
-              <w:t>การรับทราบและให้ความยินยอม</w:t>
+            <w:tcW w:w="5076" w:type="dxa"/>
+            <w:gridSpan w:val="2"/>
+          </w:tcPr>
+          <w:p>
+            <w:pPr>
+              <w:rPr>
+                <w:rFonts w:ascii="TH Sarabun New" w:hAnsi="TH Sarabun New" w:cs="TH Sarabun New"/>
+                <w:sz w:val="32"/>
+                <w:szCs w:val="32"/>
+                <w:cs/>
+              </w:rPr>
+            </w:pPr>
+            <w:r>
+              <w:rPr>
+                <w:rFonts w:ascii="TH Sarabun New" w:hAnsi="TH Sarabun New" w:cs="TH Sarabun New" w:hint="cs"/>
+                <w:sz w:val="32"/>
+                <w:szCs w:val="32"/>
+                <w:cs/>
+              </w:rPr>
+              <w:t>ชื่อ-สกุล</w:t>
+            </w:r>
+            <w:r>
+              <w:rPr>
+                <w:rFonts w:ascii="TH Sarabun New" w:hAnsi="TH Sarabun New" w:cs="TH Sarabun New"/>
+                <w:sz w:val="32"/>
+                <w:szCs w:val="32"/>
+              </w:rPr>
+              <w:t>: {</w:t>
+            </w:r>
+            <w:proofErr w:type="spellStart"/>
+            <w:r>
+              <w:rPr>
+                <w:rFonts w:ascii="TH Sarabun New" w:hAnsi="TH Sarabun New" w:cs="TH Sarabun New"/>
+                <w:sz w:val="32"/>
+                <w:szCs w:val="32"/>
+              </w:rPr>
+              <w:t>AdvisorNameTH</w:t>
+            </w:r>
+            <w:proofErr w:type="spellEnd"/>
+            <w:r>
+              <w:rPr>
+                <w:rFonts w:ascii="TH Sarabun New" w:hAnsi="TH Sarabun New" w:cs="TH Sarabun New"/>
+                <w:sz w:val="32"/>
+                <w:szCs w:val="32"/>
+              </w:rPr>
+              <w:t>}</w:t>
+            </w:r>
+          </w:p>
+        </w:tc>
+        <w:tc>
+          <w:tcPr>
+            <w:tcW w:w="5449" w:type="dxa"/>
+            <w:gridSpan w:val="5"/>
+          </w:tcPr>
+          <w:p>
+            <w:pPr>
+              <w:rPr>
+                <w:rFonts w:ascii="TH Sarabun New" w:hAnsi="TH Sarabun New" w:cs="TH Sarabun New"/>
+                <w:sz w:val="32"/>
+                <w:szCs w:val="32"/>
+              </w:rPr>
+            </w:pPr>
+            <w:r>
+              <w:rPr>
+                <w:rFonts w:ascii="TH Sarabun New" w:hAnsi="TH Sarabun New" w:cs="TH Sarabun New"/>
+                <w:sz w:val="32"/>
+                <w:szCs w:val="32"/>
+              </w:rPr>
+              <w:t>Name: {</w:t>
+            </w:r>
+            <w:proofErr w:type="spellStart"/>
+            <w:r>
+              <w:rPr>
+                <w:rFonts w:ascii="TH Sarabun New" w:hAnsi="TH Sarabun New" w:cs="TH Sarabun New"/>
+                <w:sz w:val="32"/>
+                <w:szCs w:val="32"/>
+              </w:rPr>
+              <w:t>AdvisorNameEN</w:t>
+            </w:r>
+            <w:proofErr w:type="spellEnd"/>
+            <w:r>
+              <w:rPr>
+                <w:rFonts w:ascii="TH Sarabun New" w:hAnsi="TH Sarabun New" w:cs="TH Sarabun New"/>
+                <w:sz w:val="32"/>
+                <w:szCs w:val="32"/>
+              </w:rPr>
+              <w:t>}</w:t>
             </w:r>
           </w:p>
         </w:tc>
@@ -356,49 +1015,102 @@
       <w:tr>
         <w:tc>
           <w:tcPr>
-            <w:tcW w:w="8066" w:type="dxa"/>
+            <w:tcW w:w="5076" w:type="dxa"/>
+            <w:gridSpan w:val="2"/>
+          </w:tcPr>
+          <w:p>
+            <w:pPr>
+              <w:rPr>
+                <w:rFonts w:ascii="TH Sarabun New" w:hAnsi="TH Sarabun New" w:cs="TH Sarabun New"/>
+                <w:sz w:val="32"/>
+                <w:szCs w:val="32"/>
+              </w:rPr>
+            </w:pPr>
+            <w:r>
+              <w:rPr>
+                <w:rFonts w:ascii="TH Sarabun New" w:hAnsi="TH Sarabun New" w:cs="TH Sarabun New" w:hint="cs"/>
+                <w:sz w:val="32"/>
+                <w:szCs w:val="32"/>
+                <w:cs/>
+              </w:rPr>
+              <w:t>อีเมล</w:t>
+            </w:r>
+            <w:r>
+              <w:rPr>
+                <w:rFonts w:ascii="TH Sarabun New" w:hAnsi="TH Sarabun New" w:cs="TH Sarabun New"/>
+                <w:sz w:val="32"/>
+                <w:szCs w:val="32"/>
+              </w:rPr>
+              <w:t>: {</w:t>
+            </w:r>
+            <w:proofErr w:type="spellStart"/>
+            <w:r>
+              <w:rPr>
+                <w:rFonts w:ascii="TH Sarabun New" w:hAnsi="TH Sarabun New" w:cs="TH Sarabun New"/>
+                <w:sz w:val="32"/>
+                <w:szCs w:val="32"/>
+              </w:rPr>
+              <w:t>AdvisorEmail</w:t>
+            </w:r>
+            <w:proofErr w:type="spellEnd"/>
+            <w:r>
+              <w:rPr>
+                <w:rFonts w:ascii="TH Sarabun New" w:hAnsi="TH Sarabun New" w:cs="TH Sarabun New"/>
+                <w:sz w:val="32"/>
+                <w:szCs w:val="32"/>
+              </w:rPr>
+              <w:t>}</w:t>
+            </w:r>
+          </w:p>
+        </w:tc>
+        <w:tc>
+          <w:tcPr>
+            <w:tcW w:w="5449" w:type="dxa"/>
             <w:gridSpan w:val="5"/>
           </w:tcPr>
           <w:p>
             <w:pPr>
-              <w:jc w:val="thaiDistribute"/>
-              <w:rPr>
-                <w:rFonts w:ascii="TH Sarabun New" w:hAnsi="TH Sarabun New" w:cs="TH Sarabun New"/>
-                <w:sz w:val="32"/>
-                <w:szCs w:val="32"/>
-              </w:rPr>
-            </w:pPr>
-            <w:r>
-              <w:rPr>
-                <w:rFonts w:ascii="TH Sarabun New" w:hAnsi="TH Sarabun New" w:cs="TH Sarabun New"/>
-                <w:sz w:val="32"/>
-                <w:szCs w:val="32"/>
-                <w:cs/>
-              </w:rPr>
-              <w:t>ข้าพเจ้าได้อ่าน เข้าใจ และยินยอมโดยชัดแจ้งต่อการเก็บ ใช้ เปิดเผย เก็บรักษา และลบข้อมูลตามที่ระบุไว้ข้างต้น</w:t>
-            </w:r>
-          </w:p>
-        </w:tc>
-        <w:tc>
-          <w:tcPr>
-            <w:tcW w:w="2459" w:type="dxa"/>
-            <w:gridSpan w:val="2"/>
-          </w:tcPr>
-          <w:p>
-            <w:pPr>
-              <w:rPr>
-                <w:rFonts w:ascii="TH Sarabun New" w:hAnsi="TH Sarabun New" w:cs="TH Sarabun New"/>
-                <w:sz w:val="32"/>
-                <w:szCs w:val="32"/>
-              </w:rPr>
-            </w:pPr>
-            <w:r>
-              <w:rPr>
-                <w:rFonts w:ascii="TH Sarabun New" w:hAnsi="TH Sarabun New" w:cs="TH Sarabun New"/>
-                <w:sz w:val="32"/>
-                <w:szCs w:val="32"/>
-              </w:rPr>
-              <w:t>{PDPA01Consent}</w:t>
+              <w:rPr>
+                <w:rFonts w:ascii="TH Sarabun New" w:hAnsi="TH Sarabun New" w:cs="TH Sarabun New"/>
+                <w:sz w:val="32"/>
+                <w:szCs w:val="32"/>
+                <w:cs/>
+              </w:rPr>
+            </w:pPr>
+            <w:r>
+              <w:rPr>
+                <w:rFonts w:ascii="TH Sarabun New" w:hAnsi="TH Sarabun New" w:cs="TH Sarabun New" w:hint="cs"/>
+                <w:sz w:val="32"/>
+                <w:szCs w:val="32"/>
+                <w:cs/>
+              </w:rPr>
+              <w:t>เบอร์โทรศัพท์</w:t>
+            </w:r>
+            <w:r>
+              <w:rPr>
+                <w:rFonts w:ascii="TH Sarabun New" w:hAnsi="TH Sarabun New" w:cs="TH Sarabun New"/>
+                <w:sz w:val="32"/>
+                <w:szCs w:val="32"/>
+              </w:rPr>
+              <w:t>: {</w:t>
+            </w:r>
+            <w:proofErr w:type="spellStart"/>
+            <w:r>
+              <w:rPr>
+                <w:rFonts w:ascii="TH Sarabun New" w:hAnsi="TH Sarabun New" w:cs="TH Sarabun New"/>
+                <w:sz w:val="32"/>
+                <w:szCs w:val="32"/>
+              </w:rPr>
+              <w:t>AdvisorPhone</w:t>
+            </w:r>
+            <w:proofErr w:type="spellEnd"/>
+            <w:r>
+              <w:rPr>
+                <w:rFonts w:ascii="TH Sarabun New" w:hAnsi="TH Sarabun New" w:cs="TH Sarabun New"/>
+                <w:sz w:val="32"/>
+                <w:szCs w:val="32"/>
+              </w:rPr>
+              <w:t>}</w:t>
             </w:r>
           </w:p>
         </w:tc>
@@ -406,28 +1118,27 @@
       <w:tr>
         <w:tc>
           <w:tcPr>
-            <w:tcW w:w="10525" w:type="dxa"/>
-            <w:gridSpan w:val="7"/>
-          </w:tcPr>
-          <w:p>
-            <w:pPr>
-              <w:rPr>
-                <w:rFonts w:ascii="TH Sarabun New" w:hAnsi="TH Sarabun New" w:cs="TH Sarabun New"/>
-                <w:b/>
-                <w:bCs/>
-                <w:sz w:val="32"/>
-                <w:szCs w:val="32"/>
-              </w:rPr>
-            </w:pPr>
-            <w:r>
-              <w:rPr>
-                <w:rFonts w:ascii="TH Sarabun New" w:hAnsi="TH Sarabun New" w:cs="TH Sarabun New"/>
-                <w:b/>
-                <w:bCs/>
-                <w:sz w:val="32"/>
-                <w:szCs w:val="32"/>
-              </w:rPr>
-              <w:t xml:space="preserve">(1) </w:t>
+            <w:tcW w:w="5076" w:type="dxa"/>
+            <w:gridSpan w:val="2"/>
+          </w:tcPr>
+          <w:p>
+            <w:pPr>
+              <w:rPr>
+                <w:rFonts w:ascii="TH Sarabun New" w:hAnsi="TH Sarabun New" w:cs="TH Sarabun New"/>
+                <w:sz w:val="32"/>
+                <w:szCs w:val="32"/>
+                <w:cs/>
+              </w:rPr>
+            </w:pPr>
+            <w:r>
+              <w:rPr>
+                <w:rFonts w:ascii="TH Sarabun New" w:hAnsi="TH Sarabun New" w:cs="TH Sarabun New"/>
+                <w:b/>
+                <w:bCs/>
+                <w:sz w:val="32"/>
+                <w:szCs w:val="32"/>
+              </w:rPr>
+              <w:t xml:space="preserve">(3) </w:t>
             </w:r>
             <w:r>
               <w:rPr>
@@ -438,17 +1149,46 @@
                 <w:szCs w:val="32"/>
                 <w:cs/>
               </w:rPr>
-              <w:t>ข้อมูลทั่วไปของใบสมัคร</w:t>
-            </w:r>
-            <w:r>
-              <w:rPr>
-                <w:rFonts w:ascii="TH Sarabun New" w:hAnsi="TH Sarabun New" w:cs="TH Sarabun New"/>
-                <w:b/>
-                <w:bCs/>
-                <w:sz w:val="32"/>
-                <w:szCs w:val="32"/>
-              </w:rPr>
-              <w:t xml:space="preserve"> </w:t>
+              <w:t>ข้อมูลผู้เข้าแข่งขันคนที่ 1</w:t>
+            </w:r>
+          </w:p>
+        </w:tc>
+        <w:tc>
+          <w:tcPr>
+            <w:tcW w:w="5449" w:type="dxa"/>
+            <w:gridSpan w:val="5"/>
+          </w:tcPr>
+          <w:p>
+            <w:pPr>
+              <w:rPr>
+                <w:rFonts w:ascii="TH Sarabun New" w:hAnsi="TH Sarabun New" w:cs="TH Sarabun New"/>
+                <w:sz w:val="32"/>
+                <w:szCs w:val="32"/>
+                <w:cs/>
+              </w:rPr>
+            </w:pPr>
+            <w:r>
+              <w:rPr>
+                <w:rFonts w:ascii="TH Sarabun New" w:hAnsi="TH Sarabun New" w:cs="TH Sarabun New" w:hint="cs"/>
+                <w:b/>
+                <w:bCs/>
+                <w:color w:val="EE0000"/>
+                <w:sz w:val="32"/>
+                <w:szCs w:val="32"/>
+                <w:cs/>
+              </w:rPr>
+              <w:t>ข้อมูลการแพ้อาหาร</w:t>
+            </w:r>
+            <w:r>
+              <w:rPr>
+                <w:rFonts w:ascii="TH Sarabun New" w:hAnsi="TH Sarabun New" w:cs="TH Sarabun New"/>
+                <w:b/>
+                <w:bCs/>
+                <w:color w:val="EE0000"/>
+                <w:sz w:val="32"/>
+                <w:szCs w:val="32"/>
+              </w:rPr>
+              <w:t>: {Student1Allergy}</w:t>
             </w:r>
           </w:p>
         </w:tc>
@@ -474,56 +1214,47 @@
                 <w:szCs w:val="32"/>
                 <w:cs/>
               </w:rPr>
-              <w:t>เลขที่ใบสมัคร</w:t>
-            </w:r>
-            <w:r>
-              <w:rPr>
-                <w:rFonts w:ascii="TH Sarabun New" w:hAnsi="TH Sarabun New" w:cs="TH Sarabun New"/>
-                <w:sz w:val="32"/>
-                <w:szCs w:val="32"/>
-              </w:rPr>
-              <w:t>: {CompetitorID}</w:t>
-            </w:r>
-          </w:p>
-        </w:tc>
-        <w:tc>
-          <w:tcPr>
-            <w:tcW w:w="2702" w:type="dxa"/>
-            <w:gridSpan w:val="2"/>
-          </w:tcPr>
-          <w:p>
-            <w:pPr>
-              <w:rPr>
-                <w:rFonts w:ascii="TH Sarabun New" w:hAnsi="TH Sarabun New" w:cs="TH Sarabun New"/>
-                <w:sz w:val="32"/>
-                <w:szCs w:val="32"/>
-                <w:cs/>
-              </w:rPr>
-            </w:pPr>
-            <w:r>
-              <w:rPr>
-                <w:rFonts w:ascii="TH Sarabun New" w:hAnsi="TH Sarabun New" w:cs="TH Sarabun New" w:hint="cs"/>
-                <w:sz w:val="32"/>
-                <w:szCs w:val="32"/>
-                <w:cs/>
-              </w:rPr>
-              <w:t>วันที่สมัคร</w:t>
-            </w:r>
-            <w:r>
-              <w:rPr>
-                <w:rFonts w:ascii="TH Sarabun New" w:hAnsi="TH Sarabun New" w:cs="TH Sarabun New"/>
-                <w:sz w:val="32"/>
-                <w:szCs w:val="32"/>
-              </w:rPr>
-              <w:t>: {</w:t>
-            </w:r>
-            <w:r>
-              <w:rPr>
-                <w:rFonts w:ascii="TH Sarabun New" w:hAnsi="TH Sarabun New" w:cs="TH Sarabun New"/>
-                <w:sz w:val="32"/>
-                <w:szCs w:val="32"/>
-              </w:rPr>
-              <w:t>AppliedDate</w:t>
+              <w:t>ชื่อ-สกุล</w:t>
+            </w:r>
+            <w:r>
+              <w:rPr>
+                <w:rFonts w:ascii="TH Sarabun New" w:hAnsi="TH Sarabun New" w:cs="TH Sarabun New"/>
+                <w:sz w:val="32"/>
+                <w:szCs w:val="32"/>
+              </w:rPr>
+              <w:t>: {Student1NameTH}</w:t>
+            </w:r>
+          </w:p>
+        </w:tc>
+        <w:tc>
+          <w:tcPr>
+            <w:tcW w:w="5449" w:type="dxa"/>
+            <w:gridSpan w:val="5"/>
+          </w:tcPr>
+          <w:p>
+            <w:pPr>
+              <w:rPr>
+                <w:rFonts w:ascii="TH Sarabun New" w:hAnsi="TH Sarabun New" w:cs="TH Sarabun New"/>
+                <w:sz w:val="32"/>
+                <w:szCs w:val="32"/>
+                <w:cs/>
+              </w:rPr>
+            </w:pPr>
+            <w:r>
+              <w:rPr>
+                <w:rFonts w:ascii="TH Sarabun New" w:hAnsi="TH Sarabun New" w:cs="TH Sarabun New"/>
+                <w:sz w:val="32"/>
+                <w:szCs w:val="32"/>
+              </w:rPr>
+              <w:t>Name: {</w:t>
+            </w:r>
+            <w:r>
+              <w:rPr>
+                <w:rFonts w:ascii="TH Sarabun New" w:hAnsi="TH Sarabun New" w:cs="TH Sarabun New"/>
+                <w:sz w:val="32"/>
+                <w:szCs w:val="32"/>
+              </w:rPr>
+              <w:t>Student1NameEN</w:t>
             </w:r>
             <w:r>
               <w:rPr>
@@ -532,38 +1263,6 @@
                 <w:szCs w:val="32"/>
               </w:rPr>
               <w:t>}</w:t>
-            </w:r>
-          </w:p>
-        </w:tc>
-        <w:tc>
-          <w:tcPr>
-            <w:tcW w:w="2747" w:type="dxa"/>
-            <w:gridSpan w:val="3"/>
-          </w:tcPr>
-          <w:p>
-            <w:pPr>
-              <w:rPr>
-                <w:rFonts w:ascii="TH Sarabun New" w:hAnsi="TH Sarabun New" w:cs="TH Sarabun New"/>
-                <w:sz w:val="32"/>
-                <w:szCs w:val="32"/>
-              </w:rPr>
-            </w:pPr>
-            <w:r>
-              <w:rPr>
-                <w:rFonts w:ascii="TH Sarabun New" w:hAnsi="TH Sarabun New" w:cs="TH Sarabun New" w:hint="cs"/>
-                <w:sz w:val="32"/>
-                <w:szCs w:val="32"/>
-                <w:cs/>
-              </w:rPr>
-              <w:t>วันที่อนุมัติ</w:t>
-            </w:r>
-            <w:r>
-              <w:rPr>
-                <w:rFonts w:ascii="TH Sarabun New" w:hAnsi="TH Sarabun New" w:cs="TH Sarabun New"/>
-                <w:sz w:val="32"/>
-                <w:szCs w:val="32"/>
-              </w:rPr>
-              <w:t>: {ApproveDate}</w:t>
             </w:r>
           </w:p>
         </w:tc>
@@ -571,143 +1270,6 @@
       <w:tr>
         <w:tc>
           <w:tcPr>
-            <w:tcW w:w="10525" w:type="dxa"/>
-            <w:gridSpan w:val="7"/>
-          </w:tcPr>
-          <w:p>
-            <w:pPr>
-              <w:rPr>
-                <w:rFonts w:ascii="TH Sarabun New" w:hAnsi="TH Sarabun New" w:cs="TH Sarabun New"/>
-                <w:sz w:val="32"/>
-                <w:szCs w:val="32"/>
-              </w:rPr>
-            </w:pPr>
-            <w:r>
-              <w:rPr>
-                <w:rFonts w:ascii="TH Sarabun New" w:hAnsi="TH Sarabun New" w:cs="TH Sarabun New" w:hint="cs"/>
-                <w:sz w:val="32"/>
-                <w:szCs w:val="32"/>
-                <w:cs/>
-              </w:rPr>
-              <w:t>ชื่อทีม</w:t>
-            </w:r>
-            <w:r>
-              <w:rPr>
-                <w:rFonts w:ascii="TH Sarabun New" w:hAnsi="TH Sarabun New" w:cs="TH Sarabun New"/>
-                <w:sz w:val="32"/>
-                <w:szCs w:val="32"/>
-              </w:rPr>
-              <w:t>: {TeamName}</w:t>
-            </w:r>
-          </w:p>
-        </w:tc>
-      </w:tr>
-      <w:tr>
-        <w:tc>
-          <w:tcPr>
-            <w:tcW w:w="10525" w:type="dxa"/>
-            <w:gridSpan w:val="7"/>
-          </w:tcPr>
-          <w:p>
-            <w:pPr>
-              <w:rPr>
-                <w:rFonts w:ascii="TH Sarabun New" w:hAnsi="TH Sarabun New" w:cs="TH Sarabun New"/>
-                <w:sz w:val="32"/>
-                <w:szCs w:val="32"/>
-                <w:cs/>
-              </w:rPr>
-            </w:pPr>
-            <w:r>
-              <w:rPr>
-                <w:rFonts w:ascii="TH Sarabun New" w:hAnsi="TH Sarabun New" w:cs="TH Sarabun New" w:hint="cs"/>
-                <w:sz w:val="32"/>
-                <w:szCs w:val="32"/>
-                <w:cs/>
-              </w:rPr>
-              <w:t>อีเมลติดต่อของกลุ่ม</w:t>
-            </w:r>
-            <w:r>
-              <w:rPr>
-                <w:rFonts w:ascii="TH Sarabun New" w:hAnsi="TH Sarabun New" w:cs="TH Sarabun New"/>
-                <w:sz w:val="32"/>
-                <w:szCs w:val="32"/>
-              </w:rPr>
-              <w:t>: {CompetitorEmail}</w:t>
-            </w:r>
-          </w:p>
-        </w:tc>
-      </w:tr>
-      <w:tr>
-        <w:tc>
-          <w:tcPr>
-            <w:tcW w:w="10525" w:type="dxa"/>
-            <w:gridSpan w:val="7"/>
-          </w:tcPr>
-          <w:p>
-            <w:pPr>
-              <w:rPr>
-                <w:rFonts w:ascii="TH Sarabun New" w:hAnsi="TH Sarabun New" w:cs="TH Sarabun New"/>
-                <w:sz w:val="32"/>
-                <w:szCs w:val="32"/>
-              </w:rPr>
-            </w:pPr>
-            <w:r>
-              <w:rPr>
-                <w:rFonts w:ascii="TH Sarabun New" w:hAnsi="TH Sarabun New" w:cs="TH Sarabun New" w:hint="cs"/>
-                <w:sz w:val="32"/>
-                <w:szCs w:val="32"/>
-                <w:cs/>
-              </w:rPr>
-              <w:t>สถานศึกษาหลัก</w:t>
-            </w:r>
-            <w:r>
-              <w:rPr>
-                <w:rFonts w:ascii="TH Sarabun New" w:hAnsi="TH Sarabun New" w:cs="TH Sarabun New"/>
-                <w:sz w:val="32"/>
-                <w:szCs w:val="32"/>
-              </w:rPr>
-              <w:t>: {School}</w:t>
-            </w:r>
-          </w:p>
-        </w:tc>
-      </w:tr>
-      <w:tr>
-        <w:tc>
-          <w:tcPr>
-            <w:tcW w:w="10525" w:type="dxa"/>
-            <w:gridSpan w:val="7"/>
-          </w:tcPr>
-          <w:p>
-            <w:pPr>
-              <w:rPr>
-                <w:rFonts w:ascii="TH Sarabun New" w:hAnsi="TH Sarabun New" w:cs="TH Sarabun New"/>
-                <w:sz w:val="32"/>
-                <w:szCs w:val="32"/>
-              </w:rPr>
-            </w:pPr>
-            <w:r>
-              <w:rPr>
-                <w:rFonts w:ascii="TH Sarabun New" w:hAnsi="TH Sarabun New" w:cs="TH Sarabun New" w:hint="cs"/>
-                <w:sz w:val="32"/>
-                <w:szCs w:val="32"/>
-                <w:cs/>
-              </w:rPr>
-              <w:t>เกียรติบัตร</w:t>
-            </w:r>
-            <w:r>
-              <w:rPr>
-                <w:rFonts w:ascii="TH Sarabun New" w:hAnsi="TH Sarabun New" w:cs="TH Sarabun New"/>
-                <w:sz w:val="32"/>
-                <w:szCs w:val="32"/>
-              </w:rPr>
-              <w:t>: {CertificateLang}</w:t>
-            </w:r>
-          </w:p>
-        </w:tc>
-      </w:tr>
-      <w:tr>
-        <w:tc>
-          <w:tcPr>
             <w:tcW w:w="5076" w:type="dxa"/>
             <w:gridSpan w:val="2"/>
           </w:tcPr>
@@ -722,24 +1284,38 @@
             </w:pPr>
             <w:r>
               <w:rPr>
-                <w:rFonts w:ascii="TH Sarabun New" w:hAnsi="TH Sarabun New" w:cs="TH Sarabun New"/>
-                <w:b/>
-                <w:bCs/>
-                <w:sz w:val="32"/>
-                <w:szCs w:val="32"/>
-              </w:rPr>
-              <w:t xml:space="preserve">(2) </w:t>
-            </w:r>
-            <w:r>
-              <w:rPr>
                 <w:rFonts w:ascii="TH Sarabun New" w:hAnsi="TH Sarabun New" w:cs="TH Sarabun New" w:hint="cs"/>
-                <w:b/>
-                <w:bCs/>
-                <w:sz w:val="32"/>
-                <w:szCs w:val="32"/>
-                <w:cs/>
-              </w:rPr>
-              <w:t>ข้อมูลอาจารย์ที่ปรึกษา</w:t>
+                <w:sz w:val="32"/>
+                <w:szCs w:val="32"/>
+                <w:cs/>
+              </w:rPr>
+              <w:t>อีเมล</w:t>
+            </w:r>
+            <w:r>
+              <w:rPr>
+                <w:rFonts w:ascii="TH Sarabun New" w:hAnsi="TH Sarabun New" w:cs="TH Sarabun New"/>
+                <w:sz w:val="32"/>
+                <w:szCs w:val="32"/>
+              </w:rPr>
+              <w:t>: {</w:t>
+            </w:r>
+            <w:proofErr w:type="spellStart"/>
+            <w:r>
+              <w:rPr>
+                <w:rFonts w:ascii="TH Sarabun New" w:hAnsi="TH Sarabun New" w:cs="TH Sarabun New"/>
+                <w:sz w:val="32"/>
+                <w:szCs w:val="32"/>
+              </w:rPr>
+              <w:t>CompetitorEmail</w:t>
+            </w:r>
+            <w:proofErr w:type="spellEnd"/>
+            <w:r>
+              <w:rPr>
+                <w:rFonts w:ascii="TH Sarabun New" w:hAnsi="TH Sarabun New" w:cs="TH Sarabun New"/>
+                <w:sz w:val="32"/>
+                <w:szCs w:val="32"/>
+              </w:rPr>
+              <w:t>}</w:t>
             </w:r>
           </w:p>
         </w:tc>
@@ -754,397 +1330,42 @@
                 <w:rFonts w:ascii="TH Sarabun New" w:hAnsi="TH Sarabun New" w:cs="TH Sarabun New"/>
                 <w:sz w:val="32"/>
                 <w:szCs w:val="32"/>
-                <w:cs/>
               </w:rPr>
             </w:pPr>
             <w:r>
               <w:rPr>
                 <w:rFonts w:ascii="TH Sarabun New" w:hAnsi="TH Sarabun New" w:cs="TH Sarabun New" w:hint="cs"/>
-                <w:b/>
-                <w:bCs/>
-                <w:color w:val="EE0000"/>
-                <w:sz w:val="32"/>
-                <w:szCs w:val="32"/>
-                <w:cs/>
-              </w:rPr>
-              <w:t>ข้อมูลการแพ้อาหาร</w:t>
-            </w:r>
-            <w:r>
-              <w:rPr>
-                <w:rFonts w:ascii="TH Sarabun New" w:hAnsi="TH Sarabun New" w:cs="TH Sarabun New"/>
-                <w:b/>
-                <w:bCs/>
-                <w:color w:val="EE0000"/>
+                <w:sz w:val="32"/>
+                <w:szCs w:val="32"/>
+                <w:cs/>
+              </w:rPr>
+              <w:t>เบอร์โทรศัพท์</w:t>
+            </w:r>
+            <w:r>
+              <w:rPr>
+                <w:rFonts w:ascii="TH Sarabun New" w:hAnsi="TH Sarabun New" w:cs="TH Sarabun New"/>
                 <w:sz w:val="32"/>
                 <w:szCs w:val="32"/>
               </w:rPr>
               <w:t>: {</w:t>
             </w:r>
-            <w:r>
-              <w:rPr>
-                <w:rFonts w:ascii="TH Sarabun New" w:hAnsi="TH Sarabun New" w:cs="TH Sarabun New"/>
-                <w:b/>
-                <w:bCs/>
-                <w:color w:val="EE0000"/>
-                <w:sz w:val="32"/>
-                <w:szCs w:val="32"/>
-              </w:rPr>
-              <w:t>AdvisorAllergy</w:t>
-            </w:r>
-            <w:r>
-              <w:rPr>
-                <w:rFonts w:ascii="TH Sarabun New" w:hAnsi="TH Sarabun New" w:cs="TH Sarabun New"/>
-                <w:b/>
-                <w:bCs/>
-                <w:color w:val="EE0000"/>
+            <w:proofErr w:type="spellStart"/>
+            <w:r>
+              <w:rPr>
+                <w:rFonts w:ascii="TH Sarabun New" w:hAnsi="TH Sarabun New" w:cs="TH Sarabun New"/>
+                <w:sz w:val="32"/>
+                <w:szCs w:val="32"/>
+              </w:rPr>
+              <w:t>CompetitorPhoneNumber</w:t>
+            </w:r>
+            <w:proofErr w:type="spellEnd"/>
+            <w:r>
+              <w:rPr>
+                <w:rFonts w:ascii="TH Sarabun New" w:hAnsi="TH Sarabun New" w:cs="TH Sarabun New"/>
                 <w:sz w:val="32"/>
                 <w:szCs w:val="32"/>
               </w:rPr>
               <w:t>}</w:t>
-            </w:r>
-          </w:p>
-        </w:tc>
-      </w:tr>
-      <w:tr>
-        <w:tc>
-          <w:tcPr>
-            <w:tcW w:w="5076" w:type="dxa"/>
-            <w:gridSpan w:val="2"/>
-          </w:tcPr>
-          <w:p>
-            <w:pPr>
-              <w:rPr>
-                <w:rFonts w:ascii="TH Sarabun New" w:hAnsi="TH Sarabun New" w:cs="TH Sarabun New"/>
-                <w:sz w:val="32"/>
-                <w:szCs w:val="32"/>
-                <w:cs/>
-              </w:rPr>
-            </w:pPr>
-            <w:r>
-              <w:rPr>
-                <w:rFonts w:ascii="TH Sarabun New" w:hAnsi="TH Sarabun New" w:cs="TH Sarabun New" w:hint="cs"/>
-                <w:sz w:val="32"/>
-                <w:szCs w:val="32"/>
-                <w:cs/>
-              </w:rPr>
-              <w:t>ชื่อ-สกุล</w:t>
-            </w:r>
-            <w:r>
-              <w:rPr>
-                <w:rFonts w:ascii="TH Sarabun New" w:hAnsi="TH Sarabun New" w:cs="TH Sarabun New"/>
-                <w:sz w:val="32"/>
-                <w:szCs w:val="32"/>
-              </w:rPr>
-              <w:t>: {AdvisorNameTH}</w:t>
-            </w:r>
-          </w:p>
-        </w:tc>
-        <w:tc>
-          <w:tcPr>
-            <w:tcW w:w="5449" w:type="dxa"/>
-            <w:gridSpan w:val="5"/>
-          </w:tcPr>
-          <w:p>
-            <w:pPr>
-              <w:rPr>
-                <w:rFonts w:ascii="TH Sarabun New" w:hAnsi="TH Sarabun New" w:cs="TH Sarabun New"/>
-                <w:sz w:val="32"/>
-                <w:szCs w:val="32"/>
-              </w:rPr>
-            </w:pPr>
-            <w:r>
-              <w:rPr>
-                <w:rFonts w:ascii="TH Sarabun New" w:hAnsi="TH Sarabun New" w:cs="TH Sarabun New"/>
-                <w:sz w:val="32"/>
-                <w:szCs w:val="32"/>
-              </w:rPr>
-              <w:t>Name: {AdvisorNameEN}</w:t>
-            </w:r>
-          </w:p>
-        </w:tc>
-      </w:tr>
-      <w:tr>
-        <w:tc>
-          <w:tcPr>
-            <w:tcW w:w="5076" w:type="dxa"/>
-            <w:gridSpan w:val="2"/>
-          </w:tcPr>
-          <w:p>
-            <w:pPr>
-              <w:rPr>
-                <w:rFonts w:ascii="TH Sarabun New" w:hAnsi="TH Sarabun New" w:cs="TH Sarabun New"/>
-                <w:sz w:val="32"/>
-                <w:szCs w:val="32"/>
-              </w:rPr>
-            </w:pPr>
-            <w:r>
-              <w:rPr>
-                <w:rFonts w:ascii="TH Sarabun New" w:hAnsi="TH Sarabun New" w:cs="TH Sarabun New" w:hint="cs"/>
-                <w:sz w:val="32"/>
-                <w:szCs w:val="32"/>
-                <w:cs/>
-              </w:rPr>
-              <w:t>อีเมล</w:t>
-            </w:r>
-            <w:r>
-              <w:rPr>
-                <w:rFonts w:ascii="TH Sarabun New" w:hAnsi="TH Sarabun New" w:cs="TH Sarabun New"/>
-                <w:sz w:val="32"/>
-                <w:szCs w:val="32"/>
-              </w:rPr>
-              <w:t>: {AdvisorEmail}</w:t>
-            </w:r>
-          </w:p>
-        </w:tc>
-        <w:tc>
-          <w:tcPr>
-            <w:tcW w:w="5449" w:type="dxa"/>
-            <w:gridSpan w:val="5"/>
-          </w:tcPr>
-          <w:p>
-            <w:pPr>
-              <w:rPr>
-                <w:rFonts w:ascii="TH Sarabun New" w:hAnsi="TH Sarabun New" w:cs="TH Sarabun New"/>
-                <w:sz w:val="32"/>
-                <w:szCs w:val="32"/>
-                <w:cs/>
-              </w:rPr>
-            </w:pPr>
-            <w:r>
-              <w:rPr>
-                <w:rFonts w:ascii="TH Sarabun New" w:hAnsi="TH Sarabun New" w:cs="TH Sarabun New" w:hint="cs"/>
-                <w:sz w:val="32"/>
-                <w:szCs w:val="32"/>
-                <w:cs/>
-              </w:rPr>
-              <w:t>เบอร์โทรศัพท์</w:t>
-            </w:r>
-            <w:r>
-              <w:rPr>
-                <w:rFonts w:ascii="TH Sarabun New" w:hAnsi="TH Sarabun New" w:cs="TH Sarabun New"/>
-                <w:sz w:val="32"/>
-                <w:szCs w:val="32"/>
-              </w:rPr>
-              <w:t>: {AdvisorPhone}</w:t>
-            </w:r>
-          </w:p>
-        </w:tc>
-      </w:tr>
-      <w:tr>
-        <w:tc>
-          <w:tcPr>
-            <w:tcW w:w="5076" w:type="dxa"/>
-            <w:gridSpan w:val="2"/>
-          </w:tcPr>
-          <w:p>
-            <w:pPr>
-              <w:rPr>
-                <w:rFonts w:ascii="TH Sarabun New" w:hAnsi="TH Sarabun New" w:cs="TH Sarabun New"/>
-                <w:sz w:val="32"/>
-                <w:szCs w:val="32"/>
-                <w:cs/>
-              </w:rPr>
-            </w:pPr>
-            <w:r>
-              <w:rPr>
-                <w:rFonts w:ascii="TH Sarabun New" w:hAnsi="TH Sarabun New" w:cs="TH Sarabun New"/>
-                <w:b/>
-                <w:bCs/>
-                <w:sz w:val="32"/>
-                <w:szCs w:val="32"/>
-              </w:rPr>
-              <w:t xml:space="preserve">(3) </w:t>
-            </w:r>
-            <w:r>
-              <w:rPr>
-                <w:rFonts w:ascii="TH Sarabun New" w:hAnsi="TH Sarabun New" w:cs="TH Sarabun New" w:hint="cs"/>
-                <w:b/>
-                <w:bCs/>
-                <w:sz w:val="32"/>
-                <w:szCs w:val="32"/>
-                <w:cs/>
-              </w:rPr>
-              <w:t>ข้อมูลผู้เข้าแข่งขันคนที่ 1</w:t>
-            </w:r>
-          </w:p>
-        </w:tc>
-        <w:tc>
-          <w:tcPr>
-            <w:tcW w:w="5449" w:type="dxa"/>
-            <w:gridSpan w:val="5"/>
-          </w:tcPr>
-          <w:p>
-            <w:pPr>
-              <w:rPr>
-                <w:rFonts w:ascii="TH Sarabun New" w:hAnsi="TH Sarabun New" w:cs="TH Sarabun New"/>
-                <w:sz w:val="32"/>
-                <w:szCs w:val="32"/>
-                <w:cs/>
-              </w:rPr>
-            </w:pPr>
-            <w:r>
-              <w:rPr>
-                <w:rFonts w:ascii="TH Sarabun New" w:hAnsi="TH Sarabun New" w:cs="TH Sarabun New" w:hint="cs"/>
-                <w:b/>
-                <w:bCs/>
-                <w:color w:val="EE0000"/>
-                <w:sz w:val="32"/>
-                <w:szCs w:val="32"/>
-                <w:cs/>
-              </w:rPr>
-              <w:t>ข้อมูลการแพ้อาหาร</w:t>
-            </w:r>
-            <w:r>
-              <w:rPr>
-                <w:rFonts w:ascii="TH Sarabun New" w:hAnsi="TH Sarabun New" w:cs="TH Sarabun New"/>
-                <w:b/>
-                <w:bCs/>
-                <w:color w:val="EE0000"/>
-                <w:sz w:val="32"/>
-                <w:szCs w:val="32"/>
-              </w:rPr>
-              <w:t>: {Student1Allergy}</w:t>
-            </w:r>
-          </w:p>
-        </w:tc>
-      </w:tr>
-      <w:tr>
-        <w:tc>
-          <w:tcPr>
-            <w:tcW w:w="5076" w:type="dxa"/>
-            <w:gridSpan w:val="2"/>
-          </w:tcPr>
-          <w:p>
-            <w:pPr>
-              <w:rPr>
-                <w:rFonts w:ascii="TH Sarabun New" w:hAnsi="TH Sarabun New" w:cs="TH Sarabun New"/>
-                <w:sz w:val="32"/>
-                <w:szCs w:val="32"/>
-              </w:rPr>
-            </w:pPr>
-            <w:r>
-              <w:rPr>
-                <w:rFonts w:ascii="TH Sarabun New" w:hAnsi="TH Sarabun New" w:cs="TH Sarabun New" w:hint="cs"/>
-                <w:sz w:val="32"/>
-                <w:szCs w:val="32"/>
-                <w:cs/>
-              </w:rPr>
-              <w:t>ชื่อ-สกุล</w:t>
-            </w:r>
-            <w:r>
-              <w:rPr>
-                <w:rFonts w:ascii="TH Sarabun New" w:hAnsi="TH Sarabun New" w:cs="TH Sarabun New"/>
-                <w:sz w:val="32"/>
-                <w:szCs w:val="32"/>
-              </w:rPr>
-              <w:t>: {Student1NameTH}</w:t>
-            </w:r>
-          </w:p>
-        </w:tc>
-        <w:tc>
-          <w:tcPr>
-            <w:tcW w:w="5449" w:type="dxa"/>
-            <w:gridSpan w:val="5"/>
-          </w:tcPr>
-          <w:p>
-            <w:pPr>
-              <w:rPr>
-                <w:rFonts w:ascii="TH Sarabun New" w:hAnsi="TH Sarabun New" w:cs="TH Sarabun New"/>
-                <w:sz w:val="32"/>
-                <w:szCs w:val="32"/>
-                <w:cs/>
-              </w:rPr>
-            </w:pPr>
-            <w:r>
-              <w:rPr>
-                <w:rFonts w:ascii="TH Sarabun New" w:hAnsi="TH Sarabun New" w:cs="TH Sarabun New"/>
-                <w:sz w:val="32"/>
-                <w:szCs w:val="32"/>
-              </w:rPr>
-              <w:t>Name: {</w:t>
-            </w:r>
-            <w:r>
-              <w:rPr>
-                <w:rFonts w:ascii="TH Sarabun New" w:hAnsi="TH Sarabun New" w:cs="TH Sarabun New"/>
-                <w:sz w:val="32"/>
-                <w:szCs w:val="32"/>
-              </w:rPr>
-              <w:t>Student1NameEN</w:t>
-            </w:r>
-            <w:r>
-              <w:rPr>
-                <w:rFonts w:ascii="TH Sarabun New" w:hAnsi="TH Sarabun New" w:cs="TH Sarabun New"/>
-                <w:sz w:val="32"/>
-                <w:szCs w:val="32"/>
-              </w:rPr>
-              <w:t>}</w:t>
-            </w:r>
-          </w:p>
-        </w:tc>
-      </w:tr>
-      <w:tr>
-        <w:tc>
-          <w:tcPr>
-            <w:tcW w:w="5076" w:type="dxa"/>
-            <w:gridSpan w:val="2"/>
-          </w:tcPr>
-          <w:p>
-            <w:pPr>
-              <w:rPr>
-                <w:rFonts w:ascii="TH Sarabun New" w:hAnsi="TH Sarabun New" w:cs="TH Sarabun New"/>
-                <w:sz w:val="32"/>
-                <w:szCs w:val="32"/>
-                <w:cs/>
-              </w:rPr>
-            </w:pPr>
-            <w:r>
-              <w:rPr>
-                <w:rFonts w:ascii="TH Sarabun New" w:hAnsi="TH Sarabun New" w:cs="TH Sarabun New" w:hint="cs"/>
-                <w:sz w:val="32"/>
-                <w:szCs w:val="32"/>
-                <w:cs/>
-              </w:rPr>
-              <w:t>อีเมล</w:t>
-            </w:r>
-            <w:r>
-              <w:rPr>
-                <w:rFonts w:ascii="TH Sarabun New" w:hAnsi="TH Sarabun New" w:cs="TH Sarabun New"/>
-                <w:sz w:val="32"/>
-                <w:szCs w:val="32"/>
-              </w:rPr>
-              <w:t>: {CompetitorEmail}</w:t>
-            </w:r>
-          </w:p>
-        </w:tc>
-        <w:tc>
-          <w:tcPr>
-            <w:tcW w:w="5449" w:type="dxa"/>
-            <w:gridSpan w:val="5"/>
-          </w:tcPr>
-          <w:p>
-            <w:pPr>
-              <w:rPr>
-                <w:rFonts w:ascii="TH Sarabun New" w:hAnsi="TH Sarabun New" w:cs="TH Sarabun New"/>
-                <w:sz w:val="32"/>
-                <w:szCs w:val="32"/>
-              </w:rPr>
-            </w:pPr>
-            <w:r>
-              <w:rPr>
-                <w:rFonts w:ascii="TH Sarabun New" w:hAnsi="TH Sarabun New" w:cs="TH Sarabun New" w:hint="cs"/>
-                <w:sz w:val="32"/>
-                <w:szCs w:val="32"/>
-                <w:cs/>
-              </w:rPr>
-              <w:t>เบอร์โทรศัพท์</w:t>
-            </w:r>
-            <w:r>
-              <w:rPr>
-                <w:rFonts w:ascii="TH Sarabun New" w:hAnsi="TH Sarabun New" w:cs="TH Sarabun New"/>
-                <w:sz w:val="32"/>
-                <w:szCs w:val="32"/>
-              </w:rPr>
-              <w:t>: {CompetitorPhoneNumber}</w:t>
             </w:r>
           </w:p>
         </w:tc>
@@ -1578,7 +1799,25 @@
                 <w:sz w:val="32"/>
                 <w:szCs w:val="32"/>
               </w:rPr>
-              <w:t>{TeamQRCode}</w:t>
+              <w:t>{</w:t>
+            </w:r>
+            <w:proofErr w:type="spellStart"/>
+            <w:r>
+              <w:rPr>
+                <w:rFonts w:ascii="TH Sarabun New" w:hAnsi="TH Sarabun New" w:cs="TH Sarabun New"/>
+                <w:sz w:val="32"/>
+                <w:szCs w:val="32"/>
+              </w:rPr>
+              <w:t>TeamQRCode</w:t>
+            </w:r>
+            <w:proofErr w:type="spellEnd"/>
+            <w:r>
+              <w:rPr>
+                <w:rFonts w:ascii="TH Sarabun New" w:hAnsi="TH Sarabun New" w:cs="TH Sarabun New"/>
+                <w:sz w:val="32"/>
+                <w:szCs w:val="32"/>
+              </w:rPr>
+              <w:t>}</w:t>
             </w:r>
           </w:p>
         </w:tc>
@@ -1735,7 +1974,25 @@
                 <w:sz w:val="32"/>
                 <w:szCs w:val="32"/>
               </w:rPr>
-              <w:t>: {TeamName}</w:t>
+              <w:t>: {</w:t>
+            </w:r>
+            <w:proofErr w:type="spellStart"/>
+            <w:r>
+              <w:rPr>
+                <w:rFonts w:ascii="TH Sarabun New" w:hAnsi="TH Sarabun New" w:cs="TH Sarabun New"/>
+                <w:sz w:val="32"/>
+                <w:szCs w:val="32"/>
+              </w:rPr>
+              <w:t>TeamName</w:t>
+            </w:r>
+            <w:proofErr w:type="spellEnd"/>
+            <w:r>
+              <w:rPr>
+                <w:rFonts w:ascii="TH Sarabun New" w:hAnsi="TH Sarabun New" w:cs="TH Sarabun New"/>
+                <w:sz w:val="32"/>
+                <w:szCs w:val="32"/>
+              </w:rPr>
+              <w:t>}</w:t>
             </w:r>
           </w:p>
         </w:tc>
@@ -2007,7 +2264,7 @@
 </file>
 
 <file path=word/endnotes.xml><?xml version="1.0" encoding="utf-8"?>
-<w:endnotes xmlns:wpc="http://schemas.microsoft.com/office/word/2010/wordprocessingCanvas" xmlns:cx="http://schemas.microsoft.com/office/drawing/2014/chartex" xmlns:cx1="http://schemas.microsoft.com/office/drawing/2015/9/8/chartex" xmlns:cx2="http://schemas.microsoft.com/office/drawing/2015/10/21/chartex" xmlns:cx3="http://schemas.microsoft.com/office/drawing/2016/5/9/chartex" xmlns:cx4="http://schemas.microsoft.com/office/drawing/2016/5/10/chartex" xmlns:cx5="http://schemas.microsoft.com/office/drawing/2016/5/11/chartex" xmlns:cx6="http://schemas.microsoft.com/office/drawing/2016/5/12/chartex" xmlns:cx7="http://schemas.microsoft.com/office/drawing/2016/5/13/chartex" xmlns:cx8="http://schemas.microsoft.com/office/drawing/2016/5/14/chartex" xmlns:mc="http://schemas.openxmlformats.org/markup-compatibility/2006" xmlns:aink="http://schemas.microsoft.com/office/drawing/2016/ink" xmlns:am3d="http://schemas.microsoft.com/office/drawing/2017/model3d" xmlns:o="urn:schemas-microsoft-com:office:office" xmlns:oel="http://schemas.microsoft.com/office/2019/extlst" xmlns:r="http://schemas.openxmlformats.org/officeDocument/2006/relationships" xmlns:m="http://schemas.openxmlformats.org/officeDocument/2006/math" xmlns:v="urn:schemas-microsoft-com:vml" xmlns:wp14="http://schemas.microsoft.com/office/word/2010/wordprocessingDrawing" xmlns:wp="http://schemas.openxmlformats.org/drawingml/2006/wordprocessingDrawing" xmlns:w10="urn:schemas-microsoft-com:office:word" xmlns:w="http://schemas.openxmlformats.org/wordprocessingml/2006/main" xmlns:w14="http://schemas.microsoft.com/office/word/2010/wordml" xmlns:w15="http://schemas.microsoft.com/office/word/2012/wordml" xmlns:w16cex="http://schemas.microsoft.com/office/word/2018/wordml/cex" xmlns:w16cid="http://schemas.microsoft.com/office/word/2016/wordml/cid" xmlns:w16="http://schemas.microsoft.com/office/word/2018/wordml" xmlns:w16du="http://schemas.microsoft.com/office/word/2023/wordml/word16du" xmlns:w16sdtdh="http://schemas.microsoft.com/office/word/2020/wordml/sdtdatahash" xmlns:w16sdtfl="http://schemas.microsoft.com/office/word/2024/wordml/sdtformatlock" xmlns:w16se="http://schemas.microsoft.com/office/word/2015/wordml/symex" xmlns:wpg="http://schemas.microsoft.com/office/word/2010/wordprocessingGroup" xmlns:wpi="http://schemas.microsoft.com/office/word/2010/wordprocessingInk" xmlns:wne="http://schemas.microsoft.com/office/word/2006/wordml" xmlns:wps="http://schemas.microsoft.com/office/word/2010/wordprocessingShape" mc:Ignorable="w14 w15 w16se w16cid w16 w16cex w16sdtdh w16sdtfl w16du wp14">
+<w:endnotes xmlns:wpc="http://schemas.microsoft.com/office/word/2010/wordprocessingCanvas" xmlns:cx="http://schemas.microsoft.com/office/drawing/2014/chartex" xmlns:cx1="http://schemas.microsoft.com/office/drawing/2015/9/8/chartex" xmlns:cx2="http://schemas.microsoft.com/office/drawing/2015/10/21/chartex" xmlns:cx3="http://schemas.microsoft.com/office/drawing/2016/5/9/chartex" xmlns:cx4="http://schemas.microsoft.com/office/drawing/2016/5/10/chartex" xmlns:cx5="http://schemas.microsoft.com/office/drawing/2016/5/11/chartex" xmlns:cx6="http://schemas.microsoft.com/office/drawing/2016/5/12/chartex" xmlns:cx7="http://schemas.microsoft.com/office/drawing/2016/5/13/chartex" xmlns:cx8="http://schemas.microsoft.com/office/drawing/2016/5/14/chartex" xmlns:mc="http://schemas.openxmlformats.org/markup-compatibility/2006" xmlns:aink="http://schemas.microsoft.com/office/drawing/2016/ink" xmlns:am3d="http://schemas.microsoft.com/office/drawing/2017/model3d" xmlns:o="urn:schemas-microsoft-com:office:office" xmlns:oel="http://schemas.microsoft.com/office/2019/extlst" xmlns:r="http://schemas.openxmlformats.org/officeDocument/2006/relationships" xmlns:m="http://schemas.openxmlformats.org/officeDocument/2006/math" xmlns:v="urn:schemas-microsoft-com:vml" xmlns:wp14="http://schemas.microsoft.com/office/word/2010/wordprocessingDrawing" xmlns:wp="http://schemas.openxmlformats.org/drawingml/2006/wordprocessingDrawing" xmlns:w10="urn:schemas-microsoft-com:office:word" xmlns:w="http://schemas.openxmlformats.org/wordprocessingml/2006/main" xmlns:w14="http://schemas.microsoft.com/office/word/2010/wordml" xmlns:w15="http://schemas.microsoft.com/office/word/2012/wordml" xmlns:w16cei="http://schemas.microsoft.com/office/word/2026/wordml/cei" xmlns:w16cex="http://schemas.microsoft.com/office/word/2018/wordml/cex" xmlns:w16cid="http://schemas.microsoft.com/office/word/2016/wordml/cid" xmlns:w16="http://schemas.microsoft.com/office/word/2018/wordml" xmlns:w16du="http://schemas.microsoft.com/office/word/2023/wordml/word16du" xmlns:w16sdtdh="http://schemas.microsoft.com/office/word/2020/wordml/sdtdatahash" xmlns:w16sdtfl="http://schemas.microsoft.com/office/word/2024/wordml/sdtformatlock" xmlns:w16se="http://schemas.microsoft.com/office/word/2015/wordml/symex" xmlns:wpg="http://schemas.microsoft.com/office/word/2010/wordprocessingGroup" xmlns:wpi="http://schemas.microsoft.com/office/word/2010/wordprocessingInk" xmlns:wne="http://schemas.microsoft.com/office/word/2006/wordml" xmlns:wps="http://schemas.microsoft.com/office/word/2010/wordprocessingShape" mc:Ignorable="w14 w15 w16se w16cid w16 w16cex w16sdtdh w16sdtfl w16du wp14">
   <w:endnote w:type="separator" w:id="-1">
     <w:p>
       <w:pPr>
@@ -2032,7 +2289,7 @@
 </file>
 
 <file path=word/footnotes.xml><?xml version="1.0" encoding="utf-8"?>
-<w:footnotes xmlns:wpc="http://schemas.microsoft.com/office/word/2010/wordprocessingCanvas" xmlns:cx="http://schemas.microsoft.com/office/drawing/2014/chartex" xmlns:cx1="http://schemas.microsoft.com/office/drawing/2015/9/8/chartex" xmlns:cx2="http://schemas.microsoft.com/office/drawing/2015/10/21/chartex" xmlns:cx3="http://schemas.microsoft.com/office/drawing/2016/5/9/chartex" xmlns:cx4="http://schemas.microsoft.com/office/drawing/2016/5/10/chartex" xmlns:cx5="http://schemas.microsoft.com/office/drawing/2016/5/11/chartex" xmlns:cx6="http://schemas.microsoft.com/office/drawing/2016/5/12/chartex" xmlns:cx7="http://schemas.microsoft.com/office/drawing/2016/5/13/chartex" xmlns:cx8="http://schemas.microsoft.com/office/drawing/2016/5/14/chartex" xmlns:mc="http://schemas.openxmlformats.org/markup-compatibility/2006" xmlns:aink="http://schemas.microsoft.com/office/drawing/2016/ink" xmlns:am3d="http://schemas.microsoft.com/office/drawing/2017/model3d" xmlns:o="urn:schemas-microsoft-com:office:office" xmlns:oel="http://schemas.microsoft.com/office/2019/extlst" xmlns:r="http://schemas.openxmlformats.org/officeDocument/2006/relationships" xmlns:m="http://schemas.openxmlformats.org/officeDocument/2006/math" xmlns:v="urn:schemas-microsoft-com:vml" xmlns:wp14="http://schemas.microsoft.com/office/word/2010/wordprocessingDrawing" xmlns:wp="http://schemas.openxmlformats.org/drawingml/2006/wordprocessingDrawing" xmlns:w10="urn:schemas-microsoft-com:office:word" xmlns:w="http://schemas.openxmlformats.org/wordprocessingml/2006/main" xmlns:w14="http://schemas.microsoft.com/office/word/2010/wordml" xmlns:w15="http://schemas.microsoft.com/office/word/2012/wordml" xmlns:w16cex="http://schemas.microsoft.com/office/word/2018/wordml/cex" xmlns:w16cid="http://schemas.microsoft.com/office/word/2016/wordml/cid" xmlns:w16="http://schemas.microsoft.com/office/word/2018/wordml" xmlns:w16du="http://schemas.microsoft.com/office/word/2023/wordml/word16du" xmlns:w16sdtdh="http://schemas.microsoft.com/office/word/2020/wordml/sdtdatahash" xmlns:w16sdtfl="http://schemas.microsoft.com/office/word/2024/wordml/sdtformatlock" xmlns:w16se="http://schemas.microsoft.com/office/word/2015/wordml/symex" xmlns:wpg="http://schemas.microsoft.com/office/word/2010/wordprocessingGroup" xmlns:wpi="http://schemas.microsoft.com/office/word/2010/wordprocessingInk" xmlns:wne="http://schemas.microsoft.com/office/word/2006/wordml" xmlns:wps="http://schemas.microsoft.com/office/word/2010/wordprocessingShape" mc:Ignorable="w14 w15 w16se w16cid w16 w16cex w16sdtdh w16sdtfl w16du wp14">
+<w:footnotes xmlns:wpc="http://schemas.microsoft.com/office/word/2010/wordprocessingCanvas" xmlns:cx="http://schemas.microsoft.com/office/drawing/2014/chartex" xmlns:cx1="http://schemas.microsoft.com/office/drawing/2015/9/8/chartex" xmlns:cx2="http://schemas.microsoft.com/office/drawing/2015/10/21/chartex" xmlns:cx3="http://schemas.microsoft.com/office/drawing/2016/5/9/chartex" xmlns:cx4="http://schemas.microsoft.com/office/drawing/2016/5/10/chartex" xmlns:cx5="http://schemas.microsoft.com/office/drawing/2016/5/11/chartex" xmlns:cx6="http://schemas.microsoft.com/office/drawing/2016/5/12/chartex" xmlns:cx7="http://schemas.microsoft.com/office/drawing/2016/5/13/chartex" xmlns:cx8="http://schemas.microsoft.com/office/drawing/2016/5/14/chartex" xmlns:mc="http://schemas.openxmlformats.org/markup-compatibility/2006" xmlns:aink="http://schemas.microsoft.com/office/drawing/2016/ink" xmlns:am3d="http://schemas.microsoft.com/office/drawing/2017/model3d" xmlns:o="urn:schemas-microsoft-com:office:office" xmlns:oel="http://schemas.microsoft.com/office/2019/extlst" xmlns:r="http://schemas.openxmlformats.org/officeDocument/2006/relationships" xmlns:m="http://schemas.openxmlformats.org/officeDocument/2006/math" xmlns:v="urn:schemas-microsoft-com:vml" xmlns:wp14="http://schemas.microsoft.com/office/word/2010/wordprocessingDrawing" xmlns:wp="http://schemas.openxmlformats.org/drawingml/2006/wordprocessingDrawing" xmlns:w10="urn:schemas-microsoft-com:office:word" xmlns:w="http://schemas.openxmlformats.org/wordprocessingml/2006/main" xmlns:w14="http://schemas.microsoft.com/office/word/2010/wordml" xmlns:w15="http://schemas.microsoft.com/office/word/2012/wordml" xmlns:w16cei="http://schemas.microsoft.com/office/word/2026/wordml/cei" xmlns:w16cex="http://schemas.microsoft.com/office/word/2018/wordml/cex" xmlns:w16cid="http://schemas.microsoft.com/office/word/2016/wordml/cid" xmlns:w16="http://schemas.microsoft.com/office/word/2018/wordml" xmlns:w16du="http://schemas.microsoft.com/office/word/2023/wordml/word16du" xmlns:w16sdtdh="http://schemas.microsoft.com/office/word/2020/wordml/sdtdatahash" xmlns:w16sdtfl="http://schemas.microsoft.com/office/word/2024/wordml/sdtformatlock" xmlns:w16se="http://schemas.microsoft.com/office/word/2015/wordml/symex" xmlns:wpg="http://schemas.microsoft.com/office/word/2010/wordprocessingGroup" xmlns:wpi="http://schemas.microsoft.com/office/word/2010/wordprocessingInk" xmlns:wne="http://schemas.microsoft.com/office/word/2006/wordml" xmlns:wps="http://schemas.microsoft.com/office/word/2010/wordprocessingShape" mc:Ignorable="w14 w15 w16se w16cid w16 w16cex w16sdtdh w16sdtfl w16du wp14">
   <w:footnote w:type="separator" w:id="-1">
     <w:p>
       <w:pPr>
@@ -2057,7 +2314,7 @@
 </file>
 
 <file path=word/numbering.xml><?xml version="1.0" encoding="utf-8"?>
-<w:numbering xmlns:wpc="http://schemas.microsoft.com/office/word/2010/wordprocessingCanvas" xmlns:cx="http://schemas.microsoft.com/office/drawing/2014/chartex" xmlns:cx1="http://schemas.microsoft.com/office/drawing/2015/9/8/chartex" xmlns:cx2="http://schemas.microsoft.com/office/drawing/2015/10/21/chartex" xmlns:cx3="http://schemas.microsoft.com/office/drawing/2016/5/9/chartex" xmlns:cx4="http://schemas.microsoft.com/office/drawing/2016/5/10/chartex" xmlns:cx5="http://schemas.microsoft.com/office/drawing/2016/5/11/chartex" xmlns:cx6="http://schemas.microsoft.com/office/drawing/2016/5/12/chartex" xmlns:cx7="http://schemas.microsoft.com/office/drawing/2016/5/13/chartex" xmlns:cx8="http://schemas.microsoft.com/office/drawing/2016/5/14/chartex" xmlns:mc="http://schemas.openxmlformats.org/markup-compatibility/2006" xmlns:aink="http://schemas.microsoft.com/office/drawing/2016/ink" xmlns:am3d="http://schemas.microsoft.com/office/drawing/2017/model3d" xmlns:o="urn:schemas-microsoft-com:office:office" xmlns:oel="http://schemas.microsoft.com/office/2019/extlst" xmlns:r="http://schemas.openxmlformats.org/officeDocument/2006/relationships" xmlns:m="http://schemas.openxmlformats.org/officeDocument/2006/math" xmlns:v="urn:schemas-microsoft-com:vml" xmlns:wp14="http://schemas.microsoft.com/office/word/2010/wordprocessingDrawing" xmlns:wp="http://schemas.openxmlformats.org/drawingml/2006/wordprocessingDrawing" xmlns:w10="urn:schemas-microsoft-com:office:word" xmlns:w="http://schemas.openxmlformats.org/wordprocessingml/2006/main" xmlns:w14="http://schemas.microsoft.com/office/word/2010/wordml" xmlns:w15="http://schemas.microsoft.com/office/word/2012/wordml" xmlns:w16cex="http://schemas.microsoft.com/office/word/2018/wordml/cex" xmlns:w16cid="http://schemas.microsoft.com/office/word/2016/wordml/cid" xmlns:w16="http://schemas.microsoft.com/office/word/2018/wordml" xmlns:w16du="http://schemas.microsoft.com/office/word/2023/wordml/word16du" xmlns:w16sdtdh="http://schemas.microsoft.com/office/word/2020/wordml/sdtdatahash" xmlns:w16sdtfl="http://schemas.microsoft.com/office/word/2024/wordml/sdtformatlock" xmlns:w16se="http://schemas.microsoft.com/office/word/2015/wordml/symex" xmlns:wpg="http://schemas.microsoft.com/office/word/2010/wordprocessingGroup" xmlns:wpi="http://schemas.microsoft.com/office/word/2010/wordprocessingInk" xmlns:wne="http://schemas.microsoft.com/office/word/2006/wordml" xmlns:wps="http://schemas.microsoft.com/office/word/2010/wordprocessingShape" mc:Ignorable="w14 w15 w16se w16cid w16 w16cex w16sdtdh w16sdtfl w16du wp14">
+<w:numbering xmlns:wpc="http://schemas.microsoft.com/office/word/2010/wordprocessingCanvas" xmlns:cx="http://schemas.microsoft.com/office/drawing/2014/chartex" xmlns:cx1="http://schemas.microsoft.com/office/drawing/2015/9/8/chartex" xmlns:cx2="http://schemas.microsoft.com/office/drawing/2015/10/21/chartex" xmlns:cx3="http://schemas.microsoft.com/office/drawing/2016/5/9/chartex" xmlns:cx4="http://schemas.microsoft.com/office/drawing/2016/5/10/chartex" xmlns:cx5="http://schemas.microsoft.com/office/drawing/2016/5/11/chartex" xmlns:cx6="http://schemas.microsoft.com/office/drawing/2016/5/12/chartex" xmlns:cx7="http://schemas.microsoft.com/office/drawing/2016/5/13/chartex" xmlns:cx8="http://schemas.microsoft.com/office/drawing/2016/5/14/chartex" xmlns:mc="http://schemas.openxmlformats.org/markup-compatibility/2006" xmlns:aink="http://schemas.microsoft.com/office/drawing/2016/ink" xmlns:am3d="http://schemas.microsoft.com/office/drawing/2017/model3d" xmlns:o="urn:schemas-microsoft-com:office:office" xmlns:oel="http://schemas.microsoft.com/office/2019/extlst" xmlns:r="http://schemas.openxmlformats.org/officeDocument/2006/relationships" xmlns:m="http://schemas.openxmlformats.org/officeDocument/2006/math" xmlns:v="urn:schemas-microsoft-com:vml" xmlns:wp14="http://schemas.microsoft.com/office/word/2010/wordprocessingDrawing" xmlns:wp="http://schemas.openxmlformats.org/drawingml/2006/wordprocessingDrawing" xmlns:w10="urn:schemas-microsoft-com:office:word" xmlns:w="http://schemas.openxmlformats.org/wordprocessingml/2006/main" xmlns:w14="http://schemas.microsoft.com/office/word/2010/wordml" xmlns:w15="http://schemas.microsoft.com/office/word/2012/wordml" xmlns:w16cei="http://schemas.microsoft.com/office/word/2026/wordml/cei" xmlns:w16cex="http://schemas.microsoft.com/office/word/2018/wordml/cex" xmlns:w16cid="http://schemas.microsoft.com/office/word/2016/wordml/cid" xmlns:w16="http://schemas.microsoft.com/office/word/2018/wordml" xmlns:w16du="http://schemas.microsoft.com/office/word/2023/wordml/word16du" xmlns:w16sdtdh="http://schemas.microsoft.com/office/word/2020/wordml/sdtdatahash" xmlns:w16sdtfl="http://schemas.microsoft.com/office/word/2024/wordml/sdtformatlock" xmlns:w16se="http://schemas.microsoft.com/office/word/2015/wordml/symex" xmlns:wpg="http://schemas.microsoft.com/office/word/2010/wordprocessingGroup" xmlns:wpi="http://schemas.microsoft.com/office/word/2010/wordprocessingInk" xmlns:wne="http://schemas.microsoft.com/office/word/2006/wordml" xmlns:wps="http://schemas.microsoft.com/office/word/2010/wordprocessingShape" mc:Ignorable="w14 w15 w16se w16cid w16 w16cex w16sdtdh w16sdtfl w16du wp14">
   <w:abstractNum w:abstractNumId="0" w15:restartNumberingAfterBreak="0">
     <w:nsid w:val="0A6D1DAB"/>
     <w:multiLevelType w:val="multilevel"/>

</xml_diff>